<commit_message>
feat(plotting,engine): overhaul plotting suite and fix MC simulation
This commit provides a comprehensive update to the plotting suite and the Monte Carlo engine.

Plotting:

- Overhauls the enhanced Sankey to fix layout, zoom, and positioning bugs.

- Adds 'Custom' and 'Auto-Layout' modes to the enhanced Sankey.

- Stabilizes the traditional Sankey layout to prevent it from collapsing.

- Integrates a Graphviz flow chart into the notebook.

- Fixes a bug in the Monte Carlo histogram where the mean indicator was not cleared.

- Fixes the y-axis range on the process dynamics plot.

Monte Carlo Engine:

- Corrects the TC normalization logic to ensure mass balance is respected.

General:

- Restructures the main notebook for a more logical workflow.

- Fixes various module import errors.
</commit_message>
<xml_diff>
--- a/Writing project/250902_Draft_Biodym_MFA_Paper.docx
+++ b/Writing project/250902_Draft_Biodym_MFA_Paper.docx
@@ -121,13 +121,7 @@
         <w:t>.</w:t>
       </w:r>
       <w:r>
-        <w:t xml:space="preserve"> It is</w:t>
-      </w:r>
-      <w:r>
-        <w:t xml:space="preserve"> unavoidable for nutrition, construction, energy and many other purposes</w:t>
-      </w:r>
-      <w:r>
-        <w:t>.</w:t>
+        <w:t xml:space="preserve"> It is unavoidable for nutrition, construction, energy and many other purposes.</w:t>
       </w:r>
       <w:r>
         <w:t xml:space="preserve"> </w:t>
@@ -181,13 +175,7 @@
         <w:t>he</w:t>
       </w:r>
       <w:r>
-        <w:t xml:space="preserve"> accumulation of carbon in the </w:t>
-      </w:r>
-      <w:r>
-        <w:t>atmosphere</w:t>
-      </w:r>
-      <w:r>
-        <w:t xml:space="preserve"> is the major driver for </w:t>
+        <w:t xml:space="preserve"> accumulation of carbon in the atmosphere is the major driver for </w:t>
       </w:r>
       <w:r>
         <w:t>climate change</w:t>
@@ -202,10 +190,7 @@
         <w:t xml:space="preserve"> speed of this development, </w:t>
       </w:r>
       <w:r>
-        <w:t>the o</w:t>
-      </w:r>
-      <w:r>
-        <w:t xml:space="preserve">bjective </w:t>
+        <w:t xml:space="preserve">the objective </w:t>
       </w:r>
       <w:r>
         <w:t xml:space="preserve">of Carbon neutrality and net Zero until 2050 was formulated by </w:t>
@@ -325,40 +310,19 @@
         <w:t xml:space="preserve"> sequestration of biogenic carbon</w:t>
       </w:r>
       <w:r>
+        <w:t xml:space="preserve"> by the application of biobased materials as a natural CDR strategy.</w:t>
+      </w:r>
+      <w:r>
         <w:t xml:space="preserve"> </w:t>
       </w:r>
       <w:r>
-        <w:t>by the application of biobased mat</w:t>
-      </w:r>
-      <w:r>
-        <w:t xml:space="preserve">erials as </w:t>
-      </w:r>
-      <w:r>
-        <w:t>a natural CDR strategy</w:t>
-      </w:r>
-      <w:r>
-        <w:t>.</w:t>
-      </w:r>
-      <w:r>
-        <w:t xml:space="preserve"> </w:t>
-      </w:r>
-      <w:r>
         <w:t xml:space="preserve">However, effective and strategic carbon management requires </w:t>
       </w:r>
       <w:r>
         <w:t xml:space="preserve">considering </w:t>
       </w:r>
       <w:r>
-        <w:t xml:space="preserve">the </w:t>
-      </w:r>
-      <w:r>
-        <w:t xml:space="preserve">connections to the </w:t>
-      </w:r>
-      <w:r>
-        <w:t>global carbon cycle</w:t>
-      </w:r>
-      <w:r>
-        <w:t xml:space="preserve"> as well as advanced tools to analyze large and complex systems in space and time.</w:t>
+        <w:t>the connections to the global carbon cycle as well as advanced tools to analyze large and complex systems in space and time.</w:t>
       </w:r>
     </w:p>
     <w:p>
@@ -420,10 +384,13 @@
         <w:fldChar w:fldCharType="begin"/>
       </w:r>
       <w:r>
-        <w:instrText xml:space="preserve"> ADDIN ZOTERO_ITEM CSL_CITATION {"citationID":"gM6ztbXi","properties":{"formattedCitation":"(Muhayodin et al., 2021)","plainCitation":"(Muhayodin et al., 2021)","noteIndex":0},"citationItems":[{"id":426,"uris":["http://zotero.org/users/local/FS3sY3Xu/items/2VSLS42H"],"itemData":{"id":426,"type":"article-journal","abstract":"Anaerobic co-digestion technology (AcoD) can be used to process rice straw (RS) and cow manure (CoM) to produce energy and a digestate rich in nutrients, while the improper disposal of RS and CoM causes environmental problems. The overall effectiveness of the anaerobic digestion technology can be improved by utilizing the nutrients available in the digestate. It is also a way to reduce the usage of mineral fertilizer by recycling the nutrients available in the digestate. The co-digestion of RS with CoM was performed in a newly developed digester (F1) and in a mesophilic digester (F2) used as a reference. The mass balance of C, macronutrients (N, P, K, Ca, Mg, and S), and their distribution into a liquid digestate (LD) and a solid digestate (SD) was investigated in both digesters. The mass balance was used to evaluate the carbon available in the biogas and in the digestate. It was also used to investigate the recovery potential of the macronutrients after the AD process. Moreover, the assessment of the resulting digestate was carried out to </w:instrText>
-      </w:r>
-      <w:r>
-        <w:instrText xml:space="preserve">suggest its potential use in agriculture. The amount of C measured in the biogas was the same in both digesters (41.0% and 38.0% of the initial C). Moreover, the conversion efficiency of C from the substrate into methane was 23.4% for F1 and 21.0% for F2. The Ca, Mg, K, and P were conserved in the digestate because their recovery rates (RR) were close to 100%. However, a relatively low RR was observed for N (84.1% in F1 and 86.8% in F2) and S (87.1% in F1 and 86.5% in F2) in both the digesters. After separation n of the SD, from 79.1 to 83.4% (in F1) and 75.0 to 82.4% (in F2) of the final nutrients were available in the LD. The assessment of the SD suggested its use in agriculture not only for soil amendment but also as a K-providing organic fertilizer.","container-title":"Sustainability","DOI":"10.3390/su132111568","ISSN":"2071-1050","issue":"21","journalAbbreviation":"Sustainability","language":"en","license":"https://creativecommons.org/licenses/by/4.0/","page":"11568","source":"DOI.org (Crossref)","title":"Mass Balance of C, Nutrients, and Mineralization of Nitrogen during Anaerobic Co-Digestion of Rice Straw with Cow Manure","volume":"13","author":[{"family":"Muhayodin","given":"Furqan"},{"family":"Fritze","given":"Albrecht"},{"family":"Rotter","given":"Vera Susanne"}],"issued":{"date-parts":[["2021",10,20]]},"citation-key":"muhayodinMassBalanceNutrients2021a"}}],"schema":"https://github.com/citation-style-language/schema/raw/master/csl-citation.json"} </w:instrText>
+        <w:instrText xml:space="preserve"> ADDIN ZOTERO_ITEM CSL_CITATION {"citationID":"gM6ztbXi","properties":{"formattedCitation":"(Muhayodin et al., 2021)","plainCitation":"(Muhayodin et al., 2021)","noteIndex":0},"citationItems":[{"id":426,"uris":["http://zotero.org/users/local/FS3sY3Xu/items/2VSLS42H"],"itemData":{"id":426,"type":"article-journal","abstract":"Anaerobic co-digestion technology (AcoD) can be used to process rice straw (RS) and cow manure (CoM) to produce energy and a digestate rich in nutrients, while the improper disposal of RS and CoM causes environmental problems. The overall effectiveness of the anaerobic digestion technology can be improved by utilizing the nutrients available in the digestate. It is also a way to reduce the usage of mineral fertilizer by recycling the nutrients available in the digestate. The co-digestion of RS with CoM was performed in a newly developed digester (F1) and in a mesophilic digester (F2) used as a reference. The mass balance of C, macronutrients (N, P, K, Ca, Mg, and S), and their distribution into a liquid digestate (LD) and a solid digestate (SD) was investigated in both digesters. The mass balance was used to evaluate the carbon available in the biogas and in the digestate. It was also used to investigate the recovery potential of the macronutrients after the AD process. Moreover, the assessment of the resulting digestate wa</w:instrText>
+      </w:r>
+      <w:r>
+        <w:rPr>
+          <w:lang w:val="de-DE"/>
+        </w:rPr>
+        <w:instrText xml:space="preserve">s carried out to suggest its potential use in agriculture. The amount of C measured in the biogas was the same in both digesters (41.0% and 38.0% of the initial C). Moreover, the conversion efficiency of C from the substrate into methane was 23.4% for F1 and 21.0% for F2. The Ca, Mg, K, and P were conserved in the digestate because their recovery rates (RR) were close to 100%. However, a relatively low RR was observed for N (84.1% in F1 and 86.8% in F2) and S (87.1% in F1 and 86.5% in F2) in both the digesters. After separation n of the SD, from 79.1 to 83.4% (in F1) and 75.0 to 82.4% (in F2) of the final nutrients were available in the LD. The assessment of the SD suggested its use in agriculture not only for soil amendment but also as a K-providing organic fertilizer.","container-title":"Sustainability","DOI":"10.3390/su132111568","ISSN":"2071-1050","issue":"21","journalAbbreviation":"Sustainability","language":"en","license":"https://creativecommons.org/licenses/by/4.0/","page":"11568","source":"DOI.org (Crossref)","title":"Mass Balance of C, Nutrients, and Mineralization of Nitrogen during Anaerobic Co-Digestion of Rice Straw with Cow Manure","volume":"13","author":[{"family":"Muhayodin","given":"Furqan"},{"family":"Fritze","given":"Albrecht"},{"family":"Rotter","given":"Vera Susanne"}],"issued":{"date-parts":[["2021",10,20]]},"citation-key":"muhayodinMassBalanceNutrients2021a"}}],"schema":"https://github.com/citation-style-language/schema/raw/master/csl-citation.json"} </w:instrText>
       </w:r>
       <w:r>
         <w:fldChar w:fldCharType="separate"/>
@@ -431,6 +398,7 @@
       <w:r>
         <w:rPr>
           <w:rFonts w:ascii="Arial" w:hAnsi="Arial" w:cs="Arial"/>
+          <w:lang w:val="de-DE"/>
         </w:rPr>
         <w:t>(Muhayodin et al., 2021)</w:t>
       </w:r>
@@ -438,19 +406,19 @@
         <w:fldChar w:fldCharType="end"/>
       </w:r>
       <w:r>
+        <w:rPr>
+          <w:lang w:val="de-DE"/>
+        </w:rPr>
         <w:t xml:space="preserve"> </w:t>
       </w:r>
       <w:r>
         <w:fldChar w:fldCharType="begin"/>
       </w:r>
       <w:r>
-        <w:instrText xml:space="preserve"> ADDIN</w:instrText>
-      </w:r>
-      <w:r>
-        <w:instrText xml:space="preserve"> ZOTERO_ITEM CSL_CITATION {"citationID":"mIpAaRw3","properties":{"formattedCitation":"(Fritze &amp; Rotter, 2024)","plainCitation":"(Fritze &amp; Rotter, 2024)","noteIndex":0},"citationItems":[{"id":428,"uris":["http://zotero.org/users/local/FS3sY3Xu/items/IQWI5Q4M"],"itemData":{"id":428,"type":"article-journal","abstract":"Abstract\n            Rice is the third largest agricultural commodity in the world. Intensive rice production is associated with high fertilizer application, and vast quantities of rice straw are often disposed of by open burning. As emissions of N and P from fertilizer and their impacts are highly spatially disparate, it is crucial to locally assess potential solutions for nutrient circularity. A model framework was established to evaluate the potential impact of local N, P and C cycles along with suitable circularity indicators. This framework was applied for a case study in the typical intensive rice cultivation village Hậu Mỹ Bắc B in the Mekong Delta using STAN modeling software. A novel technique, based on a patented temperature-phased anaerobic digestion (TPAD) loop-reactor design was investigated as a measure to reduce rice straw open burning, generate bioenergy and recover digestate for nutrient recirculation. The case study showed that rice straw TPAD could reduce open burning by 60%, while the N recovery rate increased to 21% when 200 ± 34 Mg/a of inorganic fertilizer was replaced with digesta</w:instrText>
-      </w:r>
-      <w:r>
-        <w:instrText xml:space="preserve">te. For C and P, the recovery rates increased to 14% and 11%, respectively. Based on the results, we concluded that TPAD has a strong impact on local nutrient circularity in terms of recirculation and sufficiency. Furthermore, the developed framework is suitable to use for master planning of nutrient circularity and for technological impact assessments at local scale. However, versatile, dynamic, and comparable monitoring frameworks with harmonized indicators to identify options for nutrient circularity are required for the detailed modeling of regional nutrient management.","container-title":"Nutrient Cycling in Agroecosystems","DOI":"10.1007/s10705-024-10378-1","ISSN":"1385-1314, 1573-0867","issue":"3","journalAbbreviation":"Nutr Cycl Agroecosyst","language":"en","page":"393-410","source":"DOI.org (Crossref)","title":"Nutrient circularity of an anaerobic digestion project in a typical intensive rice cultivation village in the Vietnamese Mekong delta region: a regional material flow analysis and discussion of modeling practices","title-short":"Nutrient circularity of an anaerobic digestion project in a typical intensive rice cultivation village in the Vietnamese Mekong delta region","volume":"129","author":[{"family":"Fritze","given":"Albrecht"},{"family":"Rotter","given":"Vera Susanne"}],"issued":{"date-parts":[["2024",12]]},"citation-key":"fritzeNutrientCircularityAnaerobic2024"}}],"schema":"https://github.com/citation-style-language/schema/raw/master/csl-citation.json"} </w:instrText>
+        <w:rPr>
+          <w:lang w:val="de-DE"/>
+        </w:rPr>
+        <w:instrText xml:space="preserve"> ADDIN ZOTERO_ITEM CSL_CITATION {"citationID":"mIpAaRw3","properties":{"formattedCitation":"(Fritze &amp; Rotter, 2024)","plainCitation":"(Fritze &amp; Rotter, 2024)","noteIndex":0},"citationItems":[{"id":428,"uris":["http://zotero.org/users/local/FS3sY3Xu/items/IQWI5Q4M"],"itemData":{"id":428,"type":"article-journal","abstract":"Abstract\n            Rice is the third largest agricultural commodity in the world. Intensive rice production is associated with high fertilizer application, and vast quantities of rice straw are often disposed of by open burning. As emissions of N and P from fertilizer and their impacts are highly spatially disparate, it is crucial to locally assess potential solutions for nutrient circularity. A model framework was established to evaluate the potential impact of local N, P and C cycles along with suitable circularity indicators. This framework was applied for a case study in the typical intensive rice cultivation village Hậu Mỹ Bắc B in the Mekong Delta using STAN modeling software. A novel technique, based on a patented temperature-phased anaerobic digestion (TPAD) loop-reactor design was investigated as a measure to reduce rice straw open burning, generate bioenergy and recover digestate for nutrient recirculation. The case study showed that rice straw TPAD could reduce open burning by 60%, while the N recovery rate increased to 21% when 200 ± 34 Mg/a of inorganic fertilizer was replaced with digestate. For C and P, the recovery rates increased to 14% and 11%, respectively. Based on the results, we concluded that TPAD has a strong impact on local nutrient circularity in terms of recirculation and sufficiency. Furthermore, the developed framework is suitable to use for master planning of nutrient circularity and for technological impact assessments at local scale. However, versatile, dynamic, and comparable monitoring frameworks with harmonized indicators to identify options for nutrient circularity are required for the detailed modeling of regional nutrient management.","container-title":"Nutrient Cycling in Agroecosystems","DOI":"10.1007/s10705-024-10378-1","ISSN":"1385-1314, 1573-0867","issue":"3","journalAbbreviation":"Nutr Cycl Agroecosyst","language":"en","page":"393-410","source":"DOI.org (Crossref)","title":"Nutrient circularity of an anaerobic digestion project in a typical intensive rice cultivation village in the Vietnamese Mekong delta region: a regional material flow analysis and discussion of modeling practices","title-short":"Nutrient circularity of an anaerobic digestion project in a typical intensive rice cultivation village in the Vietnamese Mekong delta region","volume":"129","author":[{"family":"Fritze","given":"Albrecht"},{"family":"Rotter","given":"Vera Susanne"}],"issued":{"date-parts":[["2024",12]]},"citation-key":"fritzeNutrientCircularityAnaerobic2024"}}],"schema":"https://github.com/citation-style-language/schema/raw/master/csl-citation.json"} </w:instrText>
       </w:r>
       <w:r>
         <w:fldChar w:fldCharType="separate"/>
@@ -458,6 +426,7 @@
       <w:r>
         <w:rPr>
           <w:rFonts w:ascii="Arial" w:hAnsi="Arial" w:cs="Arial"/>
+          <w:lang w:val="de-DE"/>
         </w:rPr>
         <w:t>(Fritze &amp; Rotter, 2024)</w:t>
       </w:r>
@@ -465,19 +434,31 @@
         <w:fldChar w:fldCharType="end"/>
       </w:r>
       <w:r>
-        <w:t>.</w:t>
-      </w:r>
-      <w:r>
-        <w:t xml:space="preserve"> </w:t>
-      </w:r>
-      <w:r>
+        <w:rPr>
+          <w:lang w:val="de-DE"/>
+        </w:rPr>
+        <w:t xml:space="preserve">. </w:t>
+      </w:r>
+      <w:r>
+        <w:rPr>
+          <w:lang w:val="de-DE"/>
+        </w:rPr>
         <w:t xml:space="preserve">It is based on the </w:t>
       </w:r>
       <w:r>
+        <w:rPr>
+          <w:lang w:val="de-DE"/>
+        </w:rPr>
         <w:t>law of conservation of mass</w:t>
       </w:r>
       <w:r>
-        <w:t xml:space="preserve"> and evaluates input and outputs of stocks and processes within a system defined in space and time. This makes the MFA a valuable carbon management tool, which can provide system evaluations and </w:t>
+        <w:rPr>
+          <w:lang w:val="de-DE"/>
+        </w:rPr>
+        <w:t xml:space="preserve"> and evaluates input and outputs of stocks and processes within a system defined in space and time. </w:t>
+      </w:r>
+      <w:r>
+        <w:t xml:space="preserve">This makes the MFA a valuable carbon management tool, which can provide system evaluations and </w:t>
       </w:r>
       <w:r>
         <w:t xml:space="preserve">valuable insight into the quantity and the efficiency of biogenic carbon sequestration techniques. </w:t>
@@ -558,10 +539,7 @@
         <w:t>evelopment of</w:t>
       </w:r>
       <w:r>
-        <w:t xml:space="preserve"> b</w:t>
-      </w:r>
-      <w:r>
-        <w:t>ioplastics</w:t>
+        <w:t xml:space="preserve"> bioplastics</w:t>
       </w:r>
       <w:r>
         <w:t xml:space="preserve"> </w:t>
@@ -603,21 +581,7 @@
         <w:rPr>
           <w:rFonts w:ascii="Arial" w:hAnsi="Arial" w:cs="Arial"/>
         </w:rPr>
-        <w:t>(</w:t>
-      </w:r>
-      <w:proofErr w:type="spellStart"/>
-      <w:r>
-        <w:rPr>
-          <w:rFonts w:ascii="Arial" w:hAnsi="Arial" w:cs="Arial"/>
-        </w:rPr>
-        <w:t>Aryapratama</w:t>
-      </w:r>
-      <w:proofErr w:type="spellEnd"/>
-      <w:r>
-        <w:rPr>
-          <w:rFonts w:ascii="Arial" w:hAnsi="Arial" w:cs="Arial"/>
-        </w:rPr>
-        <w:t xml:space="preserve"> &amp; Pauliuk, 2019)</w:t>
+        <w:t>(Aryapratama &amp; Pauliuk, 2019)</w:t>
       </w:r>
       <w:r>
         <w:fldChar w:fldCharType="end"/>
@@ -671,17 +635,11 @@
         <w:t>level</w:t>
       </w:r>
       <w:r>
-        <w:t xml:space="preserve"> of knowledge e.g. in python. STAN 2.7 is a very established tool. C</w:t>
-      </w:r>
-      <w:r>
-        <w:t>urrently</w:t>
+        <w:t xml:space="preserve"> of knowledge e.g. in python. STAN 2.7 is a very established tool. Currently</w:t>
       </w:r>
       <w:commentRangeStart w:id="0"/>
       <w:r>
-        <w:t xml:space="preserve"> </w:t>
-      </w:r>
-      <w:r>
-        <w:t xml:space="preserve">360 </w:t>
+        <w:t xml:space="preserve"> 360 </w:t>
       </w:r>
       <w:commentRangeEnd w:id="0"/>
       <w:r>
@@ -691,10 +649,7 @@
         <w:commentReference w:id="0"/>
       </w:r>
       <w:r>
-        <w:t>articles cite STAN 2.7 in MFA studies within the context of several environmental studies.</w:t>
-      </w:r>
-      <w:r>
-        <w:t xml:space="preserve"> Even th</w:t>
+        <w:t>articles cite STAN 2.7 in MFA studies within the context of several environmental studies. Even th</w:t>
       </w:r>
       <w:r>
         <w:t xml:space="preserve">ough </w:t>
@@ -751,13 +706,8 @@
         <w:t xml:space="preserve"> like the mineralization of biomass, and in data visualization</w:t>
       </w:r>
       <w:r>
-        <w:t xml:space="preserve">. Tools, like </w:t>
-      </w:r>
-      <w:proofErr w:type="spellStart"/>
-      <w:r>
-        <w:t>sankeyMatic</w:t>
-      </w:r>
-      <w:proofErr w:type="spellEnd"/>
+        <w:t>. Tools, like sankeyMatic</w:t>
+      </w:r>
       <w:r>
         <w:t xml:space="preserve"> (source)</w:t>
       </w:r>
@@ -857,13 +807,8 @@
       <w:r>
         <w:t xml:space="preserve">. Various researchers used ODYM for </w:t>
       </w:r>
-      <w:proofErr w:type="spellStart"/>
-      <w:r>
-        <w:t>dMFAs</w:t>
-      </w:r>
-      <w:proofErr w:type="spellEnd"/>
-      <w:r>
-        <w:t xml:space="preserve"> in the field of metals (add sources)</w:t>
+      <w:r>
+        <w:t>dMFAs in the field of metals (add sources)</w:t>
       </w:r>
       <w:r>
         <w:t>.</w:t>
@@ -901,10 +846,7 @@
         <w:t xml:space="preserve">genic </w:t>
       </w:r>
       <w:r>
-        <w:t>Dynamic Material Systems Model – bioDYM</w:t>
-      </w:r>
-      <w:r>
-        <w:t>, a python</w:t>
+        <w:t>Dynamic Material Systems Model – bioDYM, a python</w:t>
       </w:r>
       <w:r>
         <w:t>-based</w:t>
@@ -918,7 +860,6 @@
       <w:r>
         <w:t xml:space="preserve"> </w:t>
       </w:r>
-      <w:proofErr w:type="spellStart"/>
       <w:r>
         <w:t>d</w:t>
       </w:r>
@@ -928,7 +869,6 @@
       <w:r>
         <w:t>s</w:t>
       </w:r>
-      <w:proofErr w:type="spellEnd"/>
       <w:r>
         <w:t>,</w:t>
       </w:r>
@@ -975,13 +915,7 @@
         <w:t xml:space="preserve"> specific processes and mechanisms for biobased materials, which are included in the conceptualization. </w:t>
       </w:r>
       <w:r>
-        <w:t>W</w:t>
-      </w:r>
-      <w:r>
-        <w:t>ith solutions for two complex case studies</w:t>
-      </w:r>
-      <w:r>
-        <w:t>, t</w:t>
+        <w:t>With solutions for two complex case studies, t</w:t>
       </w:r>
       <w:r>
         <w:t xml:space="preserve">he </w:t>
@@ -990,10 +924,7 @@
         <w:t xml:space="preserve">study presents the </w:t>
       </w:r>
       <w:r>
-        <w:t xml:space="preserve">functionalities of </w:t>
-      </w:r>
-      <w:r>
-        <w:t>bioDYM</w:t>
+        <w:t>functionalities of bioDYM</w:t>
       </w:r>
       <w:r>
         <w:t xml:space="preserve">. Case study answers the question of the </w:t>
@@ -1695,10 +1626,7 @@
         <w:t>s</w:t>
       </w:r>
       <w:r>
-        <w:t>imulation is a commonly used approach</w:t>
-      </w:r>
-      <w:r>
-        <w:t xml:space="preserve"> for </w:t>
+        <w:t xml:space="preserve">imulation is a commonly used approach for </w:t>
       </w:r>
       <w:r>
         <w:t xml:space="preserve">addressing and quantifying the sensitivity of parameters and the </w:t>
@@ -1725,13 +1653,7 @@
         <w:t>selected parameters</w:t>
       </w:r>
       <w:r>
-        <w:t xml:space="preserve"> within different types of </w:t>
-      </w:r>
-      <w:r>
-        <w:t>distributions</w:t>
-      </w:r>
-      <w:r>
-        <w:t xml:space="preserve"> (normal, uniform, triangular)</w:t>
+        <w:t xml:space="preserve"> within different types of distributions (normal, uniform, triangular)</w:t>
       </w:r>
       <w:r>
         <w:t>.</w:t>
@@ -1803,9 +1725,6 @@
         <w:instrText xml:space="preserve"> ADDIN ZOTERO_ITEM CSL_CITATION {"citationID":"m71wyOQp","properties":{"formattedCitation":"(Abbasi et al., 2023; Kawecki et al., 2021)","plainCitation":"(Abbasi et al., 2023; Kawecki et al., 2021)","noteIndex":0},"citationItems":[{"id":500,"uris":["http://zotero.org/users/local/FS3sY3Xu/items/BFTS7DPI"],"itemData":{"id":500</w:instrText>
       </w:r>
       <w:r>
-        <w:rPr>
-          <w:lang w:val="de-DE"/>
-        </w:rPr>
         <w:instrText>,"type":"article-journal","container-title":"E</w:instrText>
       </w:r>
       <w:r>
@@ -1830,10 +1749,7 @@
         <w:t xml:space="preserve">The high value of MC-Simulation for future </w:t>
       </w:r>
       <w:r>
-        <w:t xml:space="preserve">MFA </w:t>
-      </w:r>
-      <w:r>
-        <w:t xml:space="preserve">developments </w:t>
+        <w:t xml:space="preserve">MFA developments </w:t>
       </w:r>
       <w:r>
         <w:t>is highlighted by</w:t>
@@ -1896,10 +1812,7 @@
         <w:jc w:val="both"/>
       </w:pPr>
       <w:r>
-        <w:t xml:space="preserve">The </w:t>
-      </w:r>
-      <w:r>
-        <w:t>Bio</w:t>
+        <w:t>The Bio</w:t>
       </w:r>
       <w:r>
         <w:t xml:space="preserve">genic </w:t>
@@ -2034,15 +1947,7 @@
         <w:t xml:space="preserve"> by</w:t>
       </w:r>
       <w:r>
-        <w:t xml:space="preserve"> (Lukas Hoppe, </w:t>
-      </w:r>
-      <w:proofErr w:type="gramStart"/>
-      <w:r>
-        <w:t>2020).</w:t>
-      </w:r>
-      <w:proofErr w:type="gramEnd"/>
-      <w:r>
-        <w:t xml:space="preserve"> BioDYM is </w:t>
+        <w:t xml:space="preserve"> (Lukas Hoppe, 2020). BioDYM is </w:t>
       </w:r>
       <w:r>
         <w:t xml:space="preserve">designed to </w:t>
@@ -2177,77 +2082,57 @@
         <w:t>i</w:t>
       </w:r>
       <w:r>
-        <w:t>mport</w:t>
+        <w:t xml:space="preserve">mport </w:t>
+      </w:r>
+      <w:r>
+        <w:t xml:space="preserve">of the MFA is exclusively done within the BioDYM Data Protocol (Biodym DP). It allows the structured </w:t>
+      </w:r>
+      <w:r>
+        <w:t>system definition and the set-up of system boundaries</w:t>
+      </w:r>
+      <w:r>
+        <w:t xml:space="preserve"> based</w:t>
+      </w:r>
+      <w:r>
+        <w:t>, for</w:t>
+      </w:r>
+      <w:r>
+        <w:t xml:space="preserve"> example on a developed system flow chart. T</w:t>
+      </w:r>
+      <w:r>
+        <w:t xml:space="preserve">he </w:t>
+      </w:r>
+      <w:r>
+        <w:t>BioDYM</w:t>
+      </w:r>
+      <w:r>
+        <w:t xml:space="preserve"> DP</w:t>
+      </w:r>
+      <w:r>
+        <w:t xml:space="preserve"> is a</w:t>
+      </w:r>
+      <w:r>
+        <w:t xml:space="preserve">n excel </w:t>
+      </w:r>
+      <w:r>
+        <w:t>file</w:t>
+      </w:r>
+      <w:r>
+        <w:t xml:space="preserve">, which provides a </w:t>
+      </w:r>
+      <w:r>
+        <w:t>robust</w:t>
       </w:r>
       <w:r>
         <w:t xml:space="preserve"> </w:t>
       </w:r>
       <w:r>
-        <w:t xml:space="preserve">of the MFA is exclusively done </w:t>
-      </w:r>
-      <w:r>
-        <w:t>within the BioDYM Data Protocol (</w:t>
-      </w:r>
-      <w:proofErr w:type="spellStart"/>
-      <w:r>
-        <w:t>Biodym</w:t>
-      </w:r>
-      <w:proofErr w:type="spellEnd"/>
-      <w:r>
-        <w:t xml:space="preserve"> DP)</w:t>
-      </w:r>
-      <w:r>
-        <w:t xml:space="preserve">. It allows the structured </w:t>
-      </w:r>
-      <w:r>
-        <w:t>system definition and the set-up of system boundaries</w:t>
-      </w:r>
-      <w:r>
-        <w:t xml:space="preserve"> based</w:t>
-      </w:r>
-      <w:r>
-        <w:t>, for</w:t>
-      </w:r>
-      <w:r>
-        <w:t xml:space="preserve"> example on a developed system flow chart. T</w:t>
-      </w:r>
-      <w:r>
-        <w:t xml:space="preserve">he </w:t>
-      </w:r>
-      <w:r>
-        <w:t>BioDYM</w:t>
-      </w:r>
-      <w:r>
-        <w:t xml:space="preserve"> DP</w:t>
-      </w:r>
-      <w:r>
-        <w:t xml:space="preserve"> is a</w:t>
-      </w:r>
-      <w:r>
-        <w:t>n e</w:t>
-      </w:r>
-      <w:r>
-        <w:t xml:space="preserve">xcel </w:t>
-      </w:r>
-      <w:r>
-        <w:t>file</w:t>
-      </w:r>
-      <w:r>
-        <w:t xml:space="preserve">, which provides a </w:t>
-      </w:r>
-      <w:r>
-        <w:t>robust</w:t>
+        <w:t>data infrastructure</w:t>
       </w:r>
       <w:r>
         <w:t xml:space="preserve"> </w:t>
       </w:r>
       <w:r>
-        <w:t>data infrastructure</w:t>
-      </w:r>
-      <w:r>
-        <w:t xml:space="preserve"> </w:t>
-      </w:r>
-      <w:r>
         <w:t>for</w:t>
       </w:r>
       <w:r>
@@ -2269,15 +2154,7 @@
         <w:t>is</w:t>
       </w:r>
       <w:r>
-        <w:t xml:space="preserve"> allows also the use of </w:t>
-      </w:r>
-      <w:proofErr w:type="spellStart"/>
-      <w:r>
-        <w:t>Biodym</w:t>
-      </w:r>
-      <w:proofErr w:type="spellEnd"/>
-      <w:r>
-        <w:t xml:space="preserve">, without advanced python knowledge, since the interaction with the code is not required. </w:t>
+        <w:t xml:space="preserve"> allows also the use of Biodym, without advanced python knowledge, since the interaction with the code is not required. </w:t>
       </w:r>
       <w:r>
         <w:t>The bioDYM D</w:t>
@@ -2352,15 +2229,7 @@
         <w:t xml:space="preserve">e overview </w:t>
       </w:r>
       <w:r>
-        <w:t xml:space="preserve">of the </w:t>
-      </w:r>
-      <w:proofErr w:type="spellStart"/>
-      <w:r>
-        <w:t>Biodym</w:t>
-      </w:r>
-      <w:proofErr w:type="spellEnd"/>
-      <w:r>
-        <w:t xml:space="preserve"> D</w:t>
+        <w:t>of the Biodym D</w:t>
       </w:r>
       <w:r>
         <w:t>P</w:t>
@@ -2676,18 +2545,12 @@
       <w:pPr>
         <w:jc w:val="both"/>
       </w:pPr>
-      <w:proofErr w:type="spellStart"/>
-      <w:r>
-        <w:t>BioDYMs</w:t>
-      </w:r>
-      <w:proofErr w:type="spellEnd"/>
-      <w:r>
-        <w:t xml:space="preserve"> calculation workflow consists of model execution and validation mechanisms. All elements are structured</w:t>
+      <w:r>
+        <w:t>BioDYMs calculation workflow consists of model execution and validation mechanisms. All elements are structured</w:t>
       </w:r>
       <w:r>
         <w:t xml:space="preserve"> based on the execution order in a </w:t>
       </w:r>
-      <w:proofErr w:type="spellStart"/>
       <w:r>
         <w:t>Jup</w:t>
       </w:r>
@@ -2695,11 +2558,7 @@
         <w:t>y</w:t>
       </w:r>
       <w:r>
-        <w:t>ter</w:t>
-      </w:r>
-      <w:proofErr w:type="spellEnd"/>
-      <w:r>
-        <w:t xml:space="preserve"> </w:t>
+        <w:t xml:space="preserve">ter </w:t>
       </w:r>
       <w:r>
         <w:t>N</w:t>
@@ -2815,15 +2674,7 @@
         <w:t>the in-depth analysis of the system</w:t>
       </w:r>
       <w:r>
-        <w:t xml:space="preserve">. All visualizations are interactive with widgets for the selection of specific processes, dynamic time </w:t>
-      </w:r>
-      <w:proofErr w:type="gramStart"/>
-      <w:r>
-        <w:t>sliders</w:t>
-      </w:r>
-      <w:proofErr w:type="gramEnd"/>
-      <w:r>
-        <w:t xml:space="preserve"> and export functions. </w:t>
+        <w:t xml:space="preserve">. All visualizations are interactive with widgets for the selection of specific processes, dynamic time sliders and export functions. </w:t>
       </w:r>
       <w:r>
         <w:t>A c</w:t>
@@ -2926,10 +2777,7 @@
         <w:t>wo case studies</w:t>
       </w:r>
       <w:r>
-        <w:t xml:space="preserve"> about </w:t>
-      </w:r>
-      <w:r>
-        <w:t>complex biogenic material systems</w:t>
+        <w:t xml:space="preserve"> about complex biogenic material systems</w:t>
       </w:r>
       <w:r>
         <w:t xml:space="preserve"> </w:t>
@@ -2968,10 +2816,7 @@
         <w:t xml:space="preserve"> environmental flow, originating in the environment, consisting mainly of water and other nutrients. Water and nutrients are part of the water and nutrient cycle. For the scope of the study, the atmosphere and the environment form stocks, with an unlimited supply of material. This assumption is justified with the focus on carbon flows, with the objective to model the carbon uptake of the system. </w:t>
       </w:r>
       <w:r>
-        <w:t>Both case studies describe and present in detail the functionalities of bioDYM a</w:t>
-      </w:r>
-      <w:r>
-        <w:t xml:space="preserve">nd are provided in the SI of the study. </w:t>
+        <w:t xml:space="preserve">Both case studies describe and present in detail the functionalities of bioDYM and are provided in the SI of the study. </w:t>
       </w:r>
     </w:p>
     <w:p>
@@ -2985,7 +2830,13 @@
         <w:t xml:space="preserve"> </w:t>
       </w:r>
       <w:r>
-        <w:t>Carbon cycles within the wheat straw economy</w:t>
+        <w:t xml:space="preserve">Carbon </w:t>
+      </w:r>
+      <w:r>
+        <w:t xml:space="preserve">sequestration </w:t>
+      </w:r>
+      <w:r>
+        <w:t>within the wheat straw economy</w:t>
       </w:r>
     </w:p>
     <w:p>
@@ -3011,28 +2862,16 @@
         <w:t xml:space="preserve">s to </w:t>
       </w:r>
       <w:r>
-        <w:t xml:space="preserve">analyze </w:t>
+        <w:t>analyze</w:t>
+      </w:r>
+      <w:r>
+        <w:t xml:space="preserve"> carbon sequestration potential within wheat </w:t>
       </w:r>
       <w:r>
         <w:t xml:space="preserve">carbon </w:t>
       </w:r>
       <w:r>
         <w:t>cycles</w:t>
-      </w:r>
-      <w:r>
-        <w:t xml:space="preserve"> </w:t>
-      </w:r>
-      <w:r>
-        <w:t xml:space="preserve">within the wheat </w:t>
-      </w:r>
-      <w:r>
-        <w:t>straw</w:t>
-      </w:r>
-      <w:r>
-        <w:t xml:space="preserve"> </w:t>
-      </w:r>
-      <w:r>
-        <w:t>economy</w:t>
       </w:r>
       <w:r>
         <w:t>.</w:t>
@@ -3106,6 +2945,7 @@
         <w:jc w:val="both"/>
       </w:pPr>
       <w:r>
+        <w:lastRenderedPageBreak/>
         <w:t xml:space="preserve">To evaluate the impact of </w:t>
       </w:r>
       <w:r>
@@ -3134,7 +2974,6 @@
         <w:jc w:val="both"/>
       </w:pPr>
       <w:r>
-        <w:lastRenderedPageBreak/>
         <w:t xml:space="preserve">To analyze </w:t>
       </w:r>
       <w:r>
@@ -3401,6 +3240,7 @@
         <w:jc w:val="both"/>
       </w:pPr>
       <w:r>
+        <w:lastRenderedPageBreak/>
         <w:t xml:space="preserve">Table </w:t>
       </w:r>
       <w:r>
@@ -3518,7 +3358,6 @@
               <w:jc w:val="both"/>
             </w:pPr>
             <w:r>
-              <w:lastRenderedPageBreak/>
               <w:t>P0</w:t>
             </w:r>
           </w:p>
@@ -4651,7 +4490,6 @@
               <w:rPr>
                 <w:rFonts w:eastAsiaTheme="minorEastAsia"/>
               </w:rPr>
-              <w:lastRenderedPageBreak/>
               <w:t>Yt final calculated yield for year t</w:t>
             </w:r>
           </w:p>
@@ -5032,7 +4870,10 @@
           </w:tcPr>
           <w:p>
             <w:r>
-              <w:t>none</w:t>
+              <w:t>N</w:t>
+            </w:r>
+            <w:r>
+              <w:t>one</w:t>
             </w:r>
           </w:p>
         </w:tc>
@@ -5203,10 +5044,7 @@
         <w:t>The dynamic TCs for s</w:t>
       </w:r>
       <w:r>
-        <w:t>traw collection/ distribution</w:t>
-      </w:r>
-      <w:r>
-        <w:t xml:space="preserve"> (P5) </w:t>
+        <w:t xml:space="preserve">traw collection/ distribution (P5) </w:t>
       </w:r>
       <w:r>
         <w:t>are</w:t>
@@ -5242,25 +5080,7 @@
         <w:t>).</w:t>
       </w:r>
       <w:r>
-        <w:t xml:space="preserve"> In P5 a </w:t>
-      </w:r>
-      <w:r>
-        <w:t>shift of technology</w:t>
-      </w:r>
-      <w:r>
-        <w:t xml:space="preserve"> leads to an increase of the collection efficiency of 10% until 2050, which </w:t>
-      </w:r>
-      <w:r>
-        <w:t xml:space="preserve">is modeled </w:t>
-      </w:r>
-      <w:r>
-        <w:t>using</w:t>
-      </w:r>
-      <w:r>
-        <w:t xml:space="preserve"> dynamic TCs</w:t>
-      </w:r>
-      <w:r>
-        <w:t>.</w:t>
+        <w:t xml:space="preserve"> In P5 a shift of technology leads to an increase of the collection efficiency of 10% until 2050, which is modeled using dynamic TCs.</w:t>
       </w:r>
       <w:r>
         <w:t xml:space="preserve"> </w:t>
@@ -5286,10 +5106,7 @@
         <w:t>and releases carbon emissions modelled by the</w:t>
       </w:r>
       <w:r>
-        <w:t xml:space="preserve"> </w:t>
-      </w:r>
-      <w:r>
-        <w:t>two pooled</w:t>
+        <w:t xml:space="preserve"> two pooled</w:t>
       </w:r>
       <w:r>
         <w:t xml:space="preserve"> FOMP process. Incoming biomass is split between the pools with distribution factors f</w:t>
@@ -5400,17 +5217,8 @@
           <w:b/>
           <w:bCs/>
         </w:rPr>
-        <w:t xml:space="preserve">Scenario </w:t>
-      </w:r>
-      <w:proofErr w:type="spellStart"/>
-      <w:r>
-        <w:rPr>
-          <w:b/>
-          <w:bCs/>
-        </w:rPr>
-        <w:t>Set-UP</w:t>
-      </w:r>
-      <w:proofErr w:type="spellEnd"/>
+        <w:t>Scenario Set-UP</w:t>
+      </w:r>
       <w:r>
         <w:rPr>
           <w:b/>
@@ -5426,51 +5234,228 @@
           <w:ilvl w:val="2"/>
           <w:numId w:val="40"/>
         </w:numPr>
-      </w:pPr>
-      <w:r>
-        <w:t xml:space="preserve">Case Study </w:t>
-      </w:r>
-      <w:r>
-        <w:t>2</w:t>
-      </w:r>
-      <w:r>
-        <w:t xml:space="preserve">: </w:t>
-      </w:r>
-      <w:r>
-        <w:t>Woody biomass</w:t>
-      </w:r>
-      <w:r>
-        <w:t xml:space="preserve"> cycles within the wheat straw economy</w:t>
+        <w:jc w:val="both"/>
+      </w:pPr>
+      <w:r>
+        <w:lastRenderedPageBreak/>
+        <w:t xml:space="preserve">Case Study 2: </w:t>
+      </w:r>
+      <w:r>
+        <w:t xml:space="preserve">Carbon storage potential within </w:t>
+      </w:r>
+      <w:r>
+        <w:t>Woody biomass cycles</w:t>
       </w:r>
     </w:p>
     <w:p>
       <w:pPr>
         <w:jc w:val="both"/>
-        <w:rPr>
-          <w:b/>
-          <w:bCs/>
-        </w:rPr>
-      </w:pPr>
+      </w:pPr>
+      <w:r>
+        <w:t>Objective of case study 2 (CS 2) is to analyze carbon storage potential within woody biomass carbon cycles. Specific objectives of CS 2 are:</w:t>
+      </w:r>
     </w:p>
     <w:p>
       <w:pPr>
+        <w:pStyle w:val="ListParagraph"/>
+        <w:numPr>
+          <w:ilvl w:val="0"/>
+          <w:numId w:val="41"/>
+        </w:numPr>
         <w:jc w:val="both"/>
+      </w:pPr>
+      <w:r>
+        <w:t xml:space="preserve">To quantify the annual and total carbon uptake of the system and the carbon storage potential within the build environment. </w:t>
+      </w:r>
+    </w:p>
+    <w:p>
+      <w:pPr>
+        <w:pStyle w:val="ListParagraph"/>
+        <w:numPr>
+          <w:ilvl w:val="0"/>
+          <w:numId w:val="41"/>
+        </w:numPr>
+        <w:jc w:val="both"/>
+      </w:pPr>
+      <w:r>
+        <w:t xml:space="preserve">To evaluate the impact of </w:t>
+      </w:r>
+      <w:r>
+        <w:t xml:space="preserve">the product lifetimes </w:t>
+      </w:r>
+      <w:r>
+        <w:t xml:space="preserve">with different treatment scenarios. </w:t>
+      </w:r>
+    </w:p>
+    <w:p>
+      <w:pPr>
+        <w:pStyle w:val="ListParagraph"/>
+        <w:numPr>
+          <w:ilvl w:val="0"/>
+          <w:numId w:val="41"/>
+        </w:numPr>
+        <w:jc w:val="both"/>
+      </w:pPr>
+      <w:r>
+        <w:t xml:space="preserve">To analyze </w:t>
+      </w:r>
+      <w:r>
+        <w:t xml:space="preserve">dynamic stock modelling </w:t>
+      </w:r>
+      <w:r>
+        <w:t xml:space="preserve">processes and by </w:t>
+      </w:r>
+      <w:r>
+        <w:t>woody biomass</w:t>
+      </w:r>
+      <w:r>
+        <w:t xml:space="preserve">. </w:t>
+      </w:r>
+    </w:p>
+    <w:p>
+      <w:pPr>
+        <w:pStyle w:val="ListParagraph"/>
+        <w:numPr>
+          <w:ilvl w:val="0"/>
+          <w:numId w:val="41"/>
+        </w:numPr>
+        <w:jc w:val="both"/>
+      </w:pPr>
+      <w:r>
+        <w:t>To identify most critical parameters influencing the system through a Monte Carlo simulation.</w:t>
+      </w:r>
+    </w:p>
+    <w:p>
+      <w:pPr>
+        <w:jc w:val="both"/>
+      </w:pPr>
+      <w:r>
+        <w:t xml:space="preserve">The system of CS </w:t>
+      </w:r>
+      <w:r>
+        <w:t>2</w:t>
+      </w:r>
+      <w:r>
+        <w:t xml:space="preserve"> </w:t>
+      </w:r>
+      <w:r>
+        <w:t xml:space="preserve">is focused on the use-phase of woody biomass and the application of wood within the build environment. The system covers the </w:t>
+      </w:r>
+      <w:r>
+        <w:t xml:space="preserve">raw material </w:t>
+      </w:r>
+      <w:r>
+        <w:t>extraction of wood from the forest</w:t>
+      </w:r>
+      <w:r>
+        <w:t xml:space="preserve">, </w:t>
+      </w:r>
+      <w:r>
+        <w:t xml:space="preserve">the </w:t>
+      </w:r>
+      <w:r>
+        <w:t>produc</w:t>
+      </w:r>
+      <w:r>
+        <w:t>t manufacturing of wood trusses and particle boards</w:t>
+      </w:r>
+      <w:r>
+        <w:t>,</w:t>
+      </w:r>
+      <w:r>
+        <w:t xml:space="preserve"> the </w:t>
+      </w:r>
+      <w:r>
+        <w:t>use-phase</w:t>
+      </w:r>
+      <w:r>
+        <w:t xml:space="preserve"> of different products with individual life times and the</w:t>
+      </w:r>
+      <w:r>
+        <w:t xml:space="preserve"> EoL-phase</w:t>
+      </w:r>
+      <w:r>
+        <w:t>, including a recycling process</w:t>
+      </w:r>
+      <w:r>
+        <w:t>. The system is</w:t>
+      </w:r>
+      <w:r>
+        <w:t xml:space="preserve"> again</w:t>
+      </w:r>
+      <w:r>
+        <w:t xml:space="preserve"> part of the global carbon cycle and includes the atmosphere and the lithosphere as global carbon stocks. </w:t>
+      </w:r>
+      <w:r>
+        <w:t xml:space="preserve">The geographical scope is </w:t>
+      </w:r>
+      <w:r>
+        <w:t xml:space="preserve">defined as </w:t>
+      </w:r>
+      <w:r>
+        <w:t xml:space="preserve">a representative region in </w:t>
+      </w:r>
+      <w:r>
+        <w:t>c</w:t>
+      </w:r>
+      <w:r>
+        <w:t xml:space="preserve">entral </w:t>
+      </w:r>
+      <w:r>
+        <w:t>E</w:t>
+      </w:r>
+      <w:r>
+        <w:t>urope</w:t>
+      </w:r>
+      <w:r>
+        <w:t xml:space="preserve">. </w:t>
+      </w:r>
+      <w:r>
+        <w:t xml:space="preserve">The temporal boundary for the analysis </w:t>
+      </w:r>
+      <w:r>
+        <w:t>covers</w:t>
+      </w:r>
+      <w:r>
+        <w:t xml:space="preserve"> </w:t>
+      </w:r>
+      <w:r>
+        <w:t>100</w:t>
+      </w:r>
+      <w:r>
+        <w:t xml:space="preserve"> years</w:t>
+      </w:r>
+      <w:r>
+        <w:t>, from 1950 - 2050. It is based on historical data and continues with forecasts about future developments. Figure X displays the described s</w:t>
+      </w:r>
+      <w:r>
+        <w:t xml:space="preserve">ystem diagram </w:t>
+      </w:r>
+      <w:r>
+        <w:t>of CS2 with processes, flows, stocks and system boundaries.</w:t>
+      </w:r>
+    </w:p>
+    <w:p>
+      <w:pPr>
+        <w:spacing w:after="0" w:line="240" w:lineRule="auto"/>
         <w:rPr>
-          <w:b/>
-          <w:bCs/>
+          <w:rFonts w:ascii="Times New Roman" w:eastAsia="Times New Roman" w:hAnsi="Times New Roman" w:cs="Times New Roman"/>
+          <w:kern w:val="0"/>
+          <w14:ligatures w14:val="none"/>
         </w:rPr>
       </w:pPr>
       <w:r>
         <w:rPr>
-          <w:b/>
-          <w:bCs/>
+          <w:rFonts w:ascii="Times New Roman" w:eastAsia="Times New Roman" w:hAnsi="Times New Roman" w:cs="Times New Roman"/>
+          <w:noProof/>
+          <w:kern w:val="0"/>
+          <w14:ligatures w14:val="none"/>
         </w:rPr>
-        <w:lastRenderedPageBreak/>
         <w:drawing>
-          <wp:inline distT="0" distB="0" distL="0" distR="0" wp14:anchorId="0F947FF4" wp14:editId="27D508BE">
-            <wp:extent cx="6011286" cy="2955549"/>
-            <wp:effectExtent l="0" t="0" r="8890" b="0"/>
-            <wp:docPr id="1257001111" name="Picture 4" descr="A screenshot of a computer&#10;&#10;AI-generated content may be incorrect."/>
+          <wp:inline distT="0" distB="0" distL="0" distR="0" wp14:anchorId="7B72BA3C" wp14:editId="5B7AEAC5">
+            <wp:extent cx="6144282" cy="3012471"/>
+            <wp:effectExtent l="0" t="0" r="0" b="0"/>
+            <wp:docPr id="541387288" name="Picture 1" descr="A screenshot of a computer&#10;&#10;AI-generated content may be incorrect."/>
             <wp:cNvGraphicFramePr>
               <a:graphicFrameLocks xmlns:a="http://schemas.openxmlformats.org/drawingml/2006/main" noChangeAspect="1"/>
             </wp:cNvGraphicFramePr>
@@ -5478,7 +5463,7 @@
               <a:graphicData uri="http://schemas.openxmlformats.org/drawingml/2006/picture">
                 <pic:pic xmlns:pic="http://schemas.openxmlformats.org/drawingml/2006/picture">
                   <pic:nvPicPr>
-                    <pic:cNvPr id="1257001111" name="Picture 4" descr="A screenshot of a computer&#10;&#10;AI-generated content may be incorrect."/>
+                    <pic:cNvPr id="541387288" name="Picture 1" descr="A screenshot of a computer&#10;&#10;AI-generated content may be incorrect."/>
                     <pic:cNvPicPr>
                       <a:picLocks noChangeAspect="1" noChangeArrowheads="1"/>
                     </pic:cNvPicPr>
@@ -5499,7 +5484,7 @@
                   <pic:spPr bwMode="auto">
                     <a:xfrm>
                       <a:off x="0" y="0"/>
-                      <a:ext cx="6029385" cy="2964448"/>
+                      <a:ext cx="6155037" cy="3017744"/>
                     </a:xfrm>
                     <a:prstGeom prst="rect">
                       <a:avLst/>
@@ -5521,6 +5506,7 @@
         <w:pStyle w:val="Heading1"/>
       </w:pPr>
       <w:r>
+        <w:lastRenderedPageBreak/>
         <w:t>Results</w:t>
       </w:r>
     </w:p>
@@ -5532,39 +5518,7 @@
         <w:t>BioDYM allows the dynamic material flow analysis of biogenic systems with the purpose of carbon cycle assessment. The application of BioDYM on two complex case-studies provides insights into the potentials of applications.</w:t>
       </w:r>
       <w:r>
-        <w:t xml:space="preserve"> Both </w:t>
-      </w:r>
-      <w:proofErr w:type="gramStart"/>
-      <w:r>
-        <w:t>case-studies</w:t>
-      </w:r>
-      <w:proofErr w:type="gramEnd"/>
-      <w:r>
-        <w:t xml:space="preserve"> </w:t>
-      </w:r>
-      <w:proofErr w:type="gramStart"/>
-      <w:r>
-        <w:t>are able to</w:t>
-      </w:r>
-      <w:proofErr w:type="gramEnd"/>
-      <w:r>
-        <w:t xml:space="preserve"> indicate the carbon storage </w:t>
-      </w:r>
-      <w:proofErr w:type="gramStart"/>
-      <w:r>
-        <w:t>potentials</w:t>
-      </w:r>
-      <w:proofErr w:type="gramEnd"/>
-      <w:r>
-        <w:t xml:space="preserve"> of the system </w:t>
-      </w:r>
-      <w:proofErr w:type="gramStart"/>
-      <w:r>
-        <w:t>and also</w:t>
-      </w:r>
-      <w:proofErr w:type="gramEnd"/>
-      <w:r>
-        <w:t xml:space="preserve"> the impact of the time on the carbon management approach. </w:t>
+        <w:t xml:space="preserve"> Both case-studies are able to indicate the carbon storage potentials of the system and also the impact of the time on the carbon management approach. </w:t>
       </w:r>
     </w:p>
     <w:p>
@@ -5598,23 +5552,7 @@
         <w:t xml:space="preserve">iomass contains in the median </w:t>
       </w:r>
       <w:r>
-        <w:t xml:space="preserve">carbon content of 340.000 Mg biogenic carbon. Most of the carbon is directly consumed and transferred back to the initial stages. Figure X-X </w:t>
-      </w:r>
-      <w:proofErr w:type="gramStart"/>
-      <w:r>
-        <w:t>are able to</w:t>
-      </w:r>
-      <w:proofErr w:type="gramEnd"/>
-      <w:r>
-        <w:t xml:space="preserve"> express the material, the Water, the </w:t>
-      </w:r>
-      <w:proofErr w:type="spellStart"/>
-      <w:r>
-        <w:t>drymass</w:t>
-      </w:r>
-      <w:proofErr w:type="spellEnd"/>
-      <w:r>
-        <w:t xml:space="preserve"> and the carbon flows. </w:t>
+        <w:t xml:space="preserve">carbon content of 340.000 Mg biogenic carbon. Most of the carbon is directly consumed and transferred back to the initial stages. Figure X-X are able to express the material, the Water, the drymass and the carbon flows. </w:t>
       </w:r>
       <w:r>
         <w:t>The</w:t>
@@ -5658,7 +5596,9 @@
           </w:tcPr>
           <w:p>
             <w:r>
-              <w:lastRenderedPageBreak/>
+              <w:rPr>
+                <w:noProof/>
+              </w:rPr>
               <w:drawing>
                 <wp:inline distT="0" distB="0" distL="0" distR="0" wp14:anchorId="79607E3C" wp14:editId="68837E47">
                   <wp:extent cx="2408922" cy="1800000"/>
@@ -5703,6 +5643,9 @@
           </w:tcPr>
           <w:p>
             <w:r>
+              <w:rPr>
+                <w:noProof/>
+              </w:rPr>
               <w:drawing>
                 <wp:inline distT="0" distB="0" distL="0" distR="0" wp14:anchorId="55A02F94" wp14:editId="3A77F813">
                   <wp:extent cx="2540027" cy="1800000"/>
@@ -5759,13 +5702,7 @@
           </w:tcPr>
           <w:p>
             <w:r>
-              <w:t xml:space="preserve">Dynamic Sankey Diagram of the </w:t>
-            </w:r>
-            <w:r>
-              <w:t>Water</w:t>
-            </w:r>
-            <w:r>
-              <w:t xml:space="preserve"> Flow in Year 2050.</w:t>
+              <w:t>Dynamic Sankey Diagram of the Water Flow in Year 2050.</w:t>
             </w:r>
           </w:p>
         </w:tc>
@@ -5777,6 +5714,9 @@
           </w:tcPr>
           <w:p>
             <w:r>
+              <w:rPr>
+                <w:noProof/>
+              </w:rPr>
               <w:drawing>
                 <wp:inline distT="0" distB="0" distL="0" distR="0" wp14:anchorId="0AD92B94" wp14:editId="79A017C2">
                   <wp:extent cx="2313015" cy="1800000"/>
@@ -5821,6 +5761,9 @@
           </w:tcPr>
           <w:p>
             <w:r>
+              <w:rPr>
+                <w:noProof/>
+              </w:rPr>
               <w:drawing>
                 <wp:inline distT="0" distB="0" distL="0" distR="0" wp14:anchorId="470810B5" wp14:editId="029282C4">
                   <wp:extent cx="2596794" cy="1800000"/>
@@ -5867,25 +5810,7 @@
           </w:tcPr>
           <w:p>
             <w:r>
-              <w:t xml:space="preserve">Dynamic Sankey Diagram of the </w:t>
-            </w:r>
-            <w:r>
-              <w:t>dry mass</w:t>
-            </w:r>
-            <w:r>
-              <w:t xml:space="preserve"> </w:t>
-            </w:r>
-            <w:r>
-              <w:t>f</w:t>
-            </w:r>
-            <w:r>
-              <w:t xml:space="preserve">low in </w:t>
-            </w:r>
-            <w:r>
-              <w:t>y</w:t>
-            </w:r>
-            <w:r>
-              <w:t>ear 2050.</w:t>
+              <w:t>Dynamic Sankey Diagram of the dry mass flow in year 2050.</w:t>
             </w:r>
           </w:p>
         </w:tc>
@@ -5901,18 +5826,7 @@
               <w:t>carbon</w:t>
             </w:r>
             <w:r>
-              <w:t xml:space="preserve"> </w:t>
-            </w:r>
-            <w:r>
-              <w:t xml:space="preserve">flow </w:t>
-            </w:r>
-            <w:proofErr w:type="gramStart"/>
-            <w:r>
-              <w:t>in year</w:t>
-            </w:r>
-            <w:proofErr w:type="gramEnd"/>
-            <w:r>
-              <w:t xml:space="preserve"> 2050.</w:t>
+              <w:t xml:space="preserve"> flow in year 2050.</w:t>
             </w:r>
           </w:p>
         </w:tc>
@@ -5921,6 +5835,7 @@
     <w:p/>
     <w:p>
       <w:r>
+        <w:lastRenderedPageBreak/>
         <w:t xml:space="preserve">The carbon within the soil is directly </w:t>
       </w:r>
     </w:p>
@@ -6063,7 +5978,6 @@
         <w:pStyle w:val="Heading1"/>
       </w:pPr>
       <w:r>
-        <w:lastRenderedPageBreak/>
         <w:t>Discussion</w:t>
       </w:r>
     </w:p>
@@ -6312,11 +6226,9 @@
             <w:tcW w:w="4675" w:type="dxa"/>
           </w:tcPr>
           <w:p>
-            <w:proofErr w:type="spellStart"/>
             <w:r>
               <w:t>DynTCs</w:t>
             </w:r>
-            <w:proofErr w:type="spellEnd"/>
           </w:p>
         </w:tc>
       </w:tr>
@@ -6336,11 +6248,9 @@
             <w:tcW w:w="4675" w:type="dxa"/>
           </w:tcPr>
           <w:p>
-            <w:proofErr w:type="spellStart"/>
             <w:r>
               <w:t>InitS</w:t>
             </w:r>
-            <w:proofErr w:type="spellEnd"/>
           </w:p>
         </w:tc>
       </w:tr>
@@ -6384,15 +6294,7 @@
     <w:p/>
     <w:p>
       <w:r>
-        <w:t xml:space="preserve">Objective of the study is the application of the ODYM Framework for the development of the bioDYM framework, that </w:t>
-      </w:r>
-      <w:proofErr w:type="spellStart"/>
-      <w:r>
-        <w:t>fullfilles</w:t>
-      </w:r>
-      <w:proofErr w:type="spellEnd"/>
-      <w:r>
-        <w:t xml:space="preserve"> the following requirements:</w:t>
+        <w:t>Objective of the study is the application of the ODYM Framework for the development of the bioDYM framework, that fullfilles the following requirements:</w:t>
       </w:r>
     </w:p>
     <w:p>
@@ -6404,23 +6306,8 @@
         </w:numPr>
       </w:pPr>
       <w:r>
-        <w:t xml:space="preserve">Specific for the requirements of biomass: </w:t>
-      </w:r>
-      <w:proofErr w:type="spellStart"/>
-      <w:r>
-        <w:t>Freshmass</w:t>
-      </w:r>
-      <w:proofErr w:type="spellEnd"/>
-      <w:r>
-        <w:t xml:space="preserve">, WC, </w:t>
-      </w:r>
-      <w:proofErr w:type="spellStart"/>
-      <w:r>
-        <w:t>Drymass</w:t>
-      </w:r>
-      <w:proofErr w:type="spellEnd"/>
-      <w:r>
-        <w:t>,</w:t>
+        <w:lastRenderedPageBreak/>
+        <w:t>Specific for the requirements of biomass: Freshmass, WC, Drymass,</w:t>
       </w:r>
     </w:p>
     <w:p>
@@ -6432,15 +6319,7 @@
         </w:numPr>
       </w:pPr>
       <w:r>
-        <w:t xml:space="preserve">Dynamic stock modelling. Individual </w:t>
-      </w:r>
-      <w:proofErr w:type="gramStart"/>
-      <w:r>
-        <w:t>life times</w:t>
-      </w:r>
-      <w:proofErr w:type="gramEnd"/>
-      <w:r>
-        <w:t xml:space="preserve"> within the use phase</w:t>
+        <w:t>Dynamic stock modelling. Individual life times within the use phase</w:t>
       </w:r>
     </w:p>
     <w:p>
@@ -6500,23 +6379,7 @@
         </w:numPr>
       </w:pPr>
       <w:r>
-        <w:t xml:space="preserve">The </w:t>
-      </w:r>
-      <w:proofErr w:type="spellStart"/>
-      <w:r>
-        <w:t>model_configuration</w:t>
-      </w:r>
-      <w:proofErr w:type="spellEnd"/>
-      <w:r>
-        <w:t xml:space="preserve"> allows the set-up of all major settings and system boundaries of bioDYM. The selectable is the timeframe, the selection of special processes and the use and the size of a monte Carlo simulation. A scenario manager </w:t>
-      </w:r>
-      <w:proofErr w:type="gramStart"/>
-      <w:r>
-        <w:t>allows</w:t>
-      </w:r>
-      <w:proofErr w:type="gramEnd"/>
-      <w:r>
-        <w:t xml:space="preserve"> to set up scenarios for result comparison. </w:t>
+        <w:t xml:space="preserve">The model_configuration allows the set-up of all major settings and system boundaries of bioDYM. The selectable is the timeframe, the selection of special processes and the use and the size of a monte Carlo simulation. A scenario manager allows to set up scenarios for result comparison. </w:t>
       </w:r>
     </w:p>
     <w:p>
@@ -6528,7 +6391,6 @@
         </w:numPr>
       </w:pPr>
       <w:r>
-        <w:lastRenderedPageBreak/>
         <w:t xml:space="preserve">The </w:t>
       </w:r>
       <w:r>
@@ -6570,15 +6432,7 @@
         <w:t>2_1_Definition_Processes</w:t>
       </w:r>
       <w:r>
-        <w:t xml:space="preserve">” has the objective to define the processes of the model including the process properties. These properties define the process type (Input/ process/ output), the use of Transfer coefficient &amp; Dynamic Transfer coefficient, the presence of </w:t>
-      </w:r>
-      <w:proofErr w:type="gramStart"/>
-      <w:r>
-        <w:t>an</w:t>
-      </w:r>
-      <w:proofErr w:type="gramEnd"/>
-      <w:r>
-        <w:t xml:space="preserve"> stock or an initial stock and initialize the special processes Dynamic Stock Modelling and FOMP. The individual properties are defined in the pages </w:t>
+        <w:t xml:space="preserve">” has the objective to define the processes of the model including the process properties. These properties define the process type (Input/ process/ output), the use of Transfer coefficient &amp; Dynamic Transfer coefficient, the presence of an stock or an initial stock and initialize the special processes Dynamic Stock Modelling and FOMP. The individual properties are defined in the pages </w:t>
       </w:r>
       <w:r>
         <w:t>2_3_Process_TCs</w:t>
@@ -6613,15 +6467,7 @@
     </w:p>
     <w:p>
       <w:r>
-        <w:t xml:space="preserve">The protocol applies several data management principles, data validation routines and color guiding system, as an </w:t>
-      </w:r>
-      <w:proofErr w:type="gramStart"/>
-      <w:r>
-        <w:t>assistance</w:t>
-      </w:r>
-      <w:proofErr w:type="gramEnd"/>
-      <w:r>
-        <w:t xml:space="preserve"> to lower the entry level of the application.</w:t>
+        <w:t>The protocol applies several data management principles, data validation routines and color guiding system, as an assistance to lower the entry level of the application.</w:t>
       </w:r>
     </w:p>
     <w:p/>
@@ -6647,31 +6493,11 @@
         <w:jc w:val="both"/>
       </w:pPr>
       <w:r>
-        <w:t xml:space="preserve">To ensure the expected high usability of </w:t>
-      </w:r>
-      <w:proofErr w:type="spellStart"/>
-      <w:r>
-        <w:t>Biodym</w:t>
-      </w:r>
-      <w:proofErr w:type="spellEnd"/>
-      <w:r>
-        <w:t xml:space="preserve">, the setup and data loading process is limited to the selection of the data upload path of the </w:t>
-      </w:r>
-      <w:proofErr w:type="spellStart"/>
-      <w:r>
-        <w:t>Biodym</w:t>
-      </w:r>
-      <w:proofErr w:type="spellEnd"/>
-      <w:r>
-        <w:t xml:space="preserve">-DP in the </w:t>
-      </w:r>
-      <w:proofErr w:type="spellStart"/>
-      <w:r>
-        <w:t>Biodym</w:t>
-      </w:r>
-      <w:proofErr w:type="spellEnd"/>
-      <w:r>
-        <w:t>-NB. With the initialization of bioDYM, the required packages and functions are loaded and initialized. All study-related parameters like model configuration, flows, processes, are loaded from the excel file, saved as variables and are used for the model calculation in step 2. The settings within the model configuration decide which specific calculations are executed.</w:t>
+        <w:t xml:space="preserve">To ensure the expected high usability of Biodym, the setup and data loading process is limited to the selection of the data upload path of the Biodym-DP in the Biodym-NB. With the initialization of bioDYM, the required packages and functions are loaded and initialized. All study-related parameters like model configuration, flows, processes, are loaded from the excel file, saved as variables and are used for the model calculation in </w:t>
+      </w:r>
+      <w:r>
+        <w:lastRenderedPageBreak/>
+        <w:t>step 2. The settings within the model configuration decide which specific calculations are executed.</w:t>
       </w:r>
     </w:p>
     <w:p>
@@ -6688,23 +6514,7 @@
         <w:jc w:val="both"/>
       </w:pPr>
       <w:r>
-        <w:t xml:space="preserve">The calculation engine contains the relevant calculation functions for the standard processes as well as the special processes, including the monte </w:t>
-      </w:r>
-      <w:proofErr w:type="spellStart"/>
-      <w:r>
-        <w:t>carlo</w:t>
-      </w:r>
-      <w:proofErr w:type="spellEnd"/>
-      <w:r>
-        <w:t xml:space="preserve"> calculation and the scenario calculation. To allow the data validation, the model provides a simple qualitative flow diagram and </w:t>
-      </w:r>
-      <w:proofErr w:type="gramStart"/>
-      <w:r>
-        <w:t>an</w:t>
-      </w:r>
-      <w:proofErr w:type="gramEnd"/>
-      <w:r>
-        <w:t xml:space="preserve"> dynamic mass balance check, for all elemental layers. </w:t>
+        <w:t xml:space="preserve">The calculation engine contains the relevant calculation functions for the standard processes as well as the special processes, including the monte carlo calculation and the scenario calculation. To allow the data validation, the model provides a simple qualitative flow diagram and an dynamic mass balance check, for all elemental layers. </w:t>
       </w:r>
     </w:p>
     <w:p/>
@@ -8865,6 +8675,95 @@
     </w:lvl>
   </w:abstractNum>
   <w:abstractNum w:abstractNumId="18" w15:restartNumberingAfterBreak="0">
+    <w:nsid w:val="2B71553E"/>
+    <w:multiLevelType w:val="hybridMultilevel"/>
+    <w:tmpl w:val="A1082C50"/>
+    <w:lvl w:ilvl="0" w:tplc="FFFFFFFF">
+      <w:start w:val="1"/>
+      <w:numFmt w:val="decimal"/>
+      <w:lvlText w:val="%1."/>
+      <w:lvlJc w:val="left"/>
+      <w:pPr>
+        <w:ind w:left="720" w:hanging="360"/>
+      </w:pPr>
+      <w:rPr>
+        <w:rFonts w:hint="default"/>
+      </w:rPr>
+    </w:lvl>
+    <w:lvl w:ilvl="1" w:tplc="FFFFFFFF" w:tentative="1">
+      <w:start w:val="1"/>
+      <w:numFmt w:val="lowerLetter"/>
+      <w:lvlText w:val="%2."/>
+      <w:lvlJc w:val="left"/>
+      <w:pPr>
+        <w:ind w:left="1440" w:hanging="360"/>
+      </w:pPr>
+    </w:lvl>
+    <w:lvl w:ilvl="2" w:tplc="FFFFFFFF" w:tentative="1">
+      <w:start w:val="1"/>
+      <w:numFmt w:val="lowerRoman"/>
+      <w:lvlText w:val="%3."/>
+      <w:lvlJc w:val="right"/>
+      <w:pPr>
+        <w:ind w:left="2160" w:hanging="180"/>
+      </w:pPr>
+    </w:lvl>
+    <w:lvl w:ilvl="3" w:tplc="FFFFFFFF" w:tentative="1">
+      <w:start w:val="1"/>
+      <w:numFmt w:val="decimal"/>
+      <w:lvlText w:val="%4."/>
+      <w:lvlJc w:val="left"/>
+      <w:pPr>
+        <w:ind w:left="2880" w:hanging="360"/>
+      </w:pPr>
+    </w:lvl>
+    <w:lvl w:ilvl="4" w:tplc="FFFFFFFF" w:tentative="1">
+      <w:start w:val="1"/>
+      <w:numFmt w:val="lowerLetter"/>
+      <w:lvlText w:val="%5."/>
+      <w:lvlJc w:val="left"/>
+      <w:pPr>
+        <w:ind w:left="3600" w:hanging="360"/>
+      </w:pPr>
+    </w:lvl>
+    <w:lvl w:ilvl="5" w:tplc="FFFFFFFF" w:tentative="1">
+      <w:start w:val="1"/>
+      <w:numFmt w:val="lowerRoman"/>
+      <w:lvlText w:val="%6."/>
+      <w:lvlJc w:val="right"/>
+      <w:pPr>
+        <w:ind w:left="4320" w:hanging="180"/>
+      </w:pPr>
+    </w:lvl>
+    <w:lvl w:ilvl="6" w:tplc="FFFFFFFF" w:tentative="1">
+      <w:start w:val="1"/>
+      <w:numFmt w:val="decimal"/>
+      <w:lvlText w:val="%7."/>
+      <w:lvlJc w:val="left"/>
+      <w:pPr>
+        <w:ind w:left="5040" w:hanging="360"/>
+      </w:pPr>
+    </w:lvl>
+    <w:lvl w:ilvl="7" w:tplc="FFFFFFFF" w:tentative="1">
+      <w:start w:val="1"/>
+      <w:numFmt w:val="lowerLetter"/>
+      <w:lvlText w:val="%8."/>
+      <w:lvlJc w:val="left"/>
+      <w:pPr>
+        <w:ind w:left="5760" w:hanging="360"/>
+      </w:pPr>
+    </w:lvl>
+    <w:lvl w:ilvl="8" w:tplc="FFFFFFFF" w:tentative="1">
+      <w:start w:val="1"/>
+      <w:numFmt w:val="lowerRoman"/>
+      <w:lvlText w:val="%9."/>
+      <w:lvlJc w:val="right"/>
+      <w:pPr>
+        <w:ind w:left="6480" w:hanging="180"/>
+      </w:pPr>
+    </w:lvl>
+  </w:abstractNum>
+  <w:abstractNum w:abstractNumId="19" w15:restartNumberingAfterBreak="0">
     <w:nsid w:val="2D5B2B0E"/>
     <w:multiLevelType w:val="hybridMultilevel"/>
     <w:tmpl w:val="132CBC7A"/>
@@ -8950,7 +8849,7 @@
       </w:pPr>
     </w:lvl>
   </w:abstractNum>
-  <w:abstractNum w:abstractNumId="19" w15:restartNumberingAfterBreak="0">
+  <w:abstractNum w:abstractNumId="20" w15:restartNumberingAfterBreak="0">
     <w:nsid w:val="39C15DC6"/>
     <w:multiLevelType w:val="hybridMultilevel"/>
     <w:tmpl w:val="6C50C036"/>
@@ -9090,7 +8989,7 @@
       </w:rPr>
     </w:lvl>
   </w:abstractNum>
-  <w:abstractNum w:abstractNumId="20" w15:restartNumberingAfterBreak="0">
+  <w:abstractNum w:abstractNumId="21" w15:restartNumberingAfterBreak="0">
     <w:nsid w:val="3B7C39D5"/>
     <w:multiLevelType w:val="hybridMultilevel"/>
     <w:tmpl w:val="D3588F20"/>
@@ -9203,7 +9102,7 @@
       </w:rPr>
     </w:lvl>
   </w:abstractNum>
-  <w:abstractNum w:abstractNumId="21" w15:restartNumberingAfterBreak="0">
+  <w:abstractNum w:abstractNumId="22" w15:restartNumberingAfterBreak="0">
     <w:nsid w:val="3D94252C"/>
     <w:multiLevelType w:val="multilevel"/>
     <w:tmpl w:val="0409001F"/>
@@ -9289,7 +9188,7 @@
       </w:pPr>
     </w:lvl>
   </w:abstractNum>
-  <w:abstractNum w:abstractNumId="22" w15:restartNumberingAfterBreak="0">
+  <w:abstractNum w:abstractNumId="23" w15:restartNumberingAfterBreak="0">
     <w:nsid w:val="419A763C"/>
     <w:multiLevelType w:val="multilevel"/>
     <w:tmpl w:val="C0FAB648"/>
@@ -9402,7 +9301,7 @@
       </w:pPr>
     </w:lvl>
   </w:abstractNum>
-  <w:abstractNum w:abstractNumId="23" w15:restartNumberingAfterBreak="0">
+  <w:abstractNum w:abstractNumId="24" w15:restartNumberingAfterBreak="0">
     <w:nsid w:val="46D80A7C"/>
     <w:multiLevelType w:val="multilevel"/>
     <w:tmpl w:val="C0FAB648"/>
@@ -9515,7 +9414,7 @@
       </w:pPr>
     </w:lvl>
   </w:abstractNum>
-  <w:abstractNum w:abstractNumId="24" w15:restartNumberingAfterBreak="0">
+  <w:abstractNum w:abstractNumId="25" w15:restartNumberingAfterBreak="0">
     <w:nsid w:val="4D65727E"/>
     <w:multiLevelType w:val="multilevel"/>
     <w:tmpl w:val="B15EE1A0"/>
@@ -9601,7 +9500,7 @@
       </w:pPr>
     </w:lvl>
   </w:abstractNum>
-  <w:abstractNum w:abstractNumId="25" w15:restartNumberingAfterBreak="0">
+  <w:abstractNum w:abstractNumId="26" w15:restartNumberingAfterBreak="0">
     <w:nsid w:val="4E665ECE"/>
     <w:multiLevelType w:val="hybridMultilevel"/>
     <w:tmpl w:val="95A693D8"/>
@@ -9714,7 +9613,7 @@
       </w:rPr>
     </w:lvl>
   </w:abstractNum>
-  <w:abstractNum w:abstractNumId="26" w15:restartNumberingAfterBreak="0">
+  <w:abstractNum w:abstractNumId="27" w15:restartNumberingAfterBreak="0">
     <w:nsid w:val="4F1B7BD1"/>
     <w:multiLevelType w:val="hybridMultilevel"/>
     <w:tmpl w:val="A1082C50"/>
@@ -9803,7 +9702,7 @@
       </w:pPr>
     </w:lvl>
   </w:abstractNum>
-  <w:abstractNum w:abstractNumId="27" w15:restartNumberingAfterBreak="0">
+  <w:abstractNum w:abstractNumId="28" w15:restartNumberingAfterBreak="0">
     <w:nsid w:val="52374094"/>
     <w:multiLevelType w:val="hybridMultilevel"/>
     <w:tmpl w:val="4D38D42C"/>
@@ -9889,7 +9788,7 @@
       </w:pPr>
     </w:lvl>
   </w:abstractNum>
-  <w:abstractNum w:abstractNumId="28" w15:restartNumberingAfterBreak="0">
+  <w:abstractNum w:abstractNumId="29" w15:restartNumberingAfterBreak="0">
     <w:nsid w:val="59A55E59"/>
     <w:multiLevelType w:val="multilevel"/>
     <w:tmpl w:val="C0FAB648"/>
@@ -10002,7 +9901,7 @@
       </w:pPr>
     </w:lvl>
   </w:abstractNum>
-  <w:abstractNum w:abstractNumId="29" w15:restartNumberingAfterBreak="0">
+  <w:abstractNum w:abstractNumId="30" w15:restartNumberingAfterBreak="0">
     <w:nsid w:val="5D346F17"/>
     <w:multiLevelType w:val="hybridMultilevel"/>
     <w:tmpl w:val="34306FC6"/>
@@ -10115,7 +10014,7 @@
       </w:rPr>
     </w:lvl>
   </w:abstractNum>
-  <w:abstractNum w:abstractNumId="30" w15:restartNumberingAfterBreak="0">
+  <w:abstractNum w:abstractNumId="31" w15:restartNumberingAfterBreak="0">
     <w:nsid w:val="5F74210B"/>
     <w:multiLevelType w:val="hybridMultilevel"/>
     <w:tmpl w:val="BCDE1FC0"/>
@@ -10228,7 +10127,7 @@
       </w:rPr>
     </w:lvl>
   </w:abstractNum>
-  <w:abstractNum w:abstractNumId="31" w15:restartNumberingAfterBreak="0">
+  <w:abstractNum w:abstractNumId="32" w15:restartNumberingAfterBreak="0">
     <w:nsid w:val="6316136E"/>
     <w:multiLevelType w:val="hybridMultilevel"/>
     <w:tmpl w:val="BFF83EA8"/>
@@ -10317,7 +10216,7 @@
       </w:pPr>
     </w:lvl>
   </w:abstractNum>
-  <w:abstractNum w:abstractNumId="32" w15:restartNumberingAfterBreak="0">
+  <w:abstractNum w:abstractNumId="33" w15:restartNumberingAfterBreak="0">
     <w:nsid w:val="64927330"/>
     <w:multiLevelType w:val="hybridMultilevel"/>
     <w:tmpl w:val="E57EA510"/>
@@ -10430,7 +10329,7 @@
       </w:rPr>
     </w:lvl>
   </w:abstractNum>
-  <w:abstractNum w:abstractNumId="33" w15:restartNumberingAfterBreak="0">
+  <w:abstractNum w:abstractNumId="34" w15:restartNumberingAfterBreak="0">
     <w:nsid w:val="64CE0E32"/>
     <w:multiLevelType w:val="multilevel"/>
     <w:tmpl w:val="B5BED2D4"/>
@@ -10546,7 +10445,7 @@
       </w:rPr>
     </w:lvl>
   </w:abstractNum>
-  <w:abstractNum w:abstractNumId="34" w15:restartNumberingAfterBreak="0">
+  <w:abstractNum w:abstractNumId="35" w15:restartNumberingAfterBreak="0">
     <w:nsid w:val="66307F00"/>
     <w:multiLevelType w:val="hybridMultilevel"/>
     <w:tmpl w:val="F3E89120"/>
@@ -10659,7 +10558,7 @@
       </w:rPr>
     </w:lvl>
   </w:abstractNum>
-  <w:abstractNum w:abstractNumId="35" w15:restartNumberingAfterBreak="0">
+  <w:abstractNum w:abstractNumId="36" w15:restartNumberingAfterBreak="0">
     <w:nsid w:val="6CD2074D"/>
     <w:multiLevelType w:val="hybridMultilevel"/>
     <w:tmpl w:val="6BD8B316"/>
@@ -10772,7 +10671,7 @@
       </w:rPr>
     </w:lvl>
   </w:abstractNum>
-  <w:abstractNum w:abstractNumId="36" w15:restartNumberingAfterBreak="0">
+  <w:abstractNum w:abstractNumId="37" w15:restartNumberingAfterBreak="0">
     <w:nsid w:val="752145BE"/>
     <w:multiLevelType w:val="multilevel"/>
     <w:tmpl w:val="C0FAB648"/>
@@ -10885,7 +10784,7 @@
       </w:pPr>
     </w:lvl>
   </w:abstractNum>
-  <w:abstractNum w:abstractNumId="37" w15:restartNumberingAfterBreak="0">
+  <w:abstractNum w:abstractNumId="38" w15:restartNumberingAfterBreak="0">
     <w:nsid w:val="78CF64C8"/>
     <w:multiLevelType w:val="hybridMultilevel"/>
     <w:tmpl w:val="429CA7D2"/>
@@ -10998,7 +10897,7 @@
       </w:rPr>
     </w:lvl>
   </w:abstractNum>
-  <w:abstractNum w:abstractNumId="38" w15:restartNumberingAfterBreak="0">
+  <w:abstractNum w:abstractNumId="39" w15:restartNumberingAfterBreak="0">
     <w:nsid w:val="7CD85125"/>
     <w:multiLevelType w:val="hybridMultilevel"/>
     <w:tmpl w:val="7CC2C112"/>
@@ -11112,13 +11011,13 @@
     </w:lvl>
   </w:abstractNum>
   <w:num w:numId="1" w16cid:durableId="993141843">
-    <w:abstractNumId w:val="18"/>
+    <w:abstractNumId w:val="19"/>
   </w:num>
   <w:num w:numId="2" w16cid:durableId="953511880">
     <w:abstractNumId w:val="8"/>
   </w:num>
   <w:num w:numId="3" w16cid:durableId="1245991012">
-    <w:abstractNumId w:val="25"/>
+    <w:abstractNumId w:val="26"/>
   </w:num>
   <w:num w:numId="4" w16cid:durableId="128666295">
     <w:abstractNumId w:val="1"/>
@@ -11127,19 +11026,19 @@
     <w:abstractNumId w:val="10"/>
   </w:num>
   <w:num w:numId="6" w16cid:durableId="1740983186">
-    <w:abstractNumId w:val="30"/>
+    <w:abstractNumId w:val="31"/>
   </w:num>
   <w:num w:numId="7" w16cid:durableId="1570773045">
-    <w:abstractNumId w:val="34"/>
+    <w:abstractNumId w:val="35"/>
   </w:num>
   <w:num w:numId="8" w16cid:durableId="87821452">
-    <w:abstractNumId w:val="37"/>
+    <w:abstractNumId w:val="38"/>
   </w:num>
   <w:num w:numId="9" w16cid:durableId="202836834">
-    <w:abstractNumId w:val="27"/>
+    <w:abstractNumId w:val="28"/>
   </w:num>
   <w:num w:numId="10" w16cid:durableId="918054786">
-    <w:abstractNumId w:val="21"/>
+    <w:abstractNumId w:val="22"/>
   </w:num>
   <w:num w:numId="11" w16cid:durableId="769664530">
     <w:abstractNumId w:val="16"/>
@@ -11148,16 +11047,16 @@
     <w:abstractNumId w:val="0"/>
   </w:num>
   <w:num w:numId="13" w16cid:durableId="629361584">
-    <w:abstractNumId w:val="29"/>
+    <w:abstractNumId w:val="30"/>
   </w:num>
   <w:num w:numId="14" w16cid:durableId="520630174">
-    <w:abstractNumId w:val="35"/>
+    <w:abstractNumId w:val="36"/>
   </w:num>
   <w:num w:numId="15" w16cid:durableId="1288510668">
-    <w:abstractNumId w:val="38"/>
+    <w:abstractNumId w:val="39"/>
   </w:num>
   <w:num w:numId="16" w16cid:durableId="168447182">
-    <w:abstractNumId w:val="24"/>
+    <w:abstractNumId w:val="25"/>
   </w:num>
   <w:num w:numId="17" w16cid:durableId="1981494692">
     <w:abstractNumId w:val="7"/>
@@ -11166,16 +11065,16 @@
     <w:abstractNumId w:val="12"/>
   </w:num>
   <w:num w:numId="19" w16cid:durableId="638925292">
-    <w:abstractNumId w:val="32"/>
+    <w:abstractNumId w:val="33"/>
   </w:num>
   <w:num w:numId="20" w16cid:durableId="235552325">
     <w:abstractNumId w:val="17"/>
   </w:num>
   <w:num w:numId="21" w16cid:durableId="804469271">
-    <w:abstractNumId w:val="20"/>
+    <w:abstractNumId w:val="21"/>
   </w:num>
   <w:num w:numId="22" w16cid:durableId="815797542">
-    <w:abstractNumId w:val="31"/>
+    <w:abstractNumId w:val="32"/>
   </w:num>
   <w:num w:numId="23" w16cid:durableId="1563983823">
     <w:abstractNumId w:val="11"/>
@@ -11187,7 +11086,7 @@
     <w:abstractNumId w:val="15"/>
   </w:num>
   <w:num w:numId="26" w16cid:durableId="283318195">
-    <w:abstractNumId w:val="33"/>
+    <w:abstractNumId w:val="34"/>
   </w:num>
   <w:num w:numId="27" w16cid:durableId="280109225">
     <w:abstractNumId w:val="3"/>
@@ -11196,13 +11095,13 @@
     <w:abstractNumId w:val="5"/>
   </w:num>
   <w:num w:numId="29" w16cid:durableId="971909474">
-    <w:abstractNumId w:val="26"/>
+    <w:abstractNumId w:val="27"/>
   </w:num>
   <w:num w:numId="30" w16cid:durableId="116263623">
     <w:abstractNumId w:val="4"/>
   </w:num>
   <w:num w:numId="31" w16cid:durableId="830295423">
-    <w:abstractNumId w:val="23"/>
+    <w:abstractNumId w:val="24"/>
   </w:num>
   <w:num w:numId="32" w16cid:durableId="734013376">
     <w:abstractNumId w:val="6"/>
@@ -11211,16 +11110,16 @@
     <w:abstractNumId w:val="13"/>
   </w:num>
   <w:num w:numId="34" w16cid:durableId="763844842">
-    <w:abstractNumId w:val="22"/>
+    <w:abstractNumId w:val="23"/>
   </w:num>
   <w:num w:numId="35" w16cid:durableId="1406142502">
-    <w:abstractNumId w:val="36"/>
+    <w:abstractNumId w:val="37"/>
   </w:num>
   <w:num w:numId="36" w16cid:durableId="1179542533">
-    <w:abstractNumId w:val="28"/>
+    <w:abstractNumId w:val="29"/>
   </w:num>
   <w:num w:numId="37" w16cid:durableId="217740814">
-    <w:abstractNumId w:val="19"/>
+    <w:abstractNumId w:val="20"/>
   </w:num>
   <w:num w:numId="38" w16cid:durableId="1071075926">
     <w:abstractNumId w:val="14"/>
@@ -11229,7 +11128,7 @@
     <w:abstractNumId w:val="9"/>
   </w:num>
   <w:num w:numId="40" w16cid:durableId="484509956">
-    <w:abstractNumId w:val="33"/>
+    <w:abstractNumId w:val="34"/>
     <w:lvlOverride w:ilvl="0">
       <w:startOverride w:val="1"/>
     </w:lvlOverride>
@@ -11257,6 +11156,9 @@
     <w:lvlOverride w:ilvl="8">
       <w:startOverride w:val="1"/>
     </w:lvlOverride>
+  </w:num>
+  <w:num w:numId="41" w16cid:durableId="1841385284">
+    <w:abstractNumId w:val="18"/>
   </w:num>
 </w:numbering>
 </file>
@@ -11864,6 +11766,7 @@
   <w:style w:type="character" w:default="1" w:styleId="DefaultParagraphFont">
     <w:name w:val="Default Paragraph Font"/>
     <w:uiPriority w:val="1"/>
+    <w:semiHidden/>
     <w:unhideWhenUsed/>
   </w:style>
   <w:style w:type="table" w:default="1" w:styleId="TableNormal">

</xml_diff>

<commit_message>
Refactor Project. Flatten project structure
</commit_message>
<xml_diff>
--- a/Writing project/250902_Draft_Biodym_MFA_Paper.docx
+++ b/Writing project/250902_Draft_Biodym_MFA_Paper.docx
@@ -439,23 +439,215 @@
         </w:rPr>
         <w:t xml:space="preserve">. </w:t>
       </w:r>
+      <w:proofErr w:type="spellStart"/>
       <w:r>
         <w:rPr>
           <w:lang w:val="de-DE"/>
         </w:rPr>
-        <w:t xml:space="preserve">It is based on the </w:t>
-      </w:r>
+        <w:t>It</w:t>
+      </w:r>
+      <w:proofErr w:type="spellEnd"/>
       <w:r>
         <w:rPr>
           <w:lang w:val="de-DE"/>
         </w:rPr>
-        <w:t>law of conservation of mass</w:t>
-      </w:r>
+        <w:t xml:space="preserve"> </w:t>
+      </w:r>
+      <w:proofErr w:type="spellStart"/>
       <w:r>
         <w:rPr>
           <w:lang w:val="de-DE"/>
         </w:rPr>
-        <w:t xml:space="preserve"> and evaluates input and outputs of stocks and processes within a system defined in space and time. </w:t>
+        <w:t>is</w:t>
+      </w:r>
+      <w:proofErr w:type="spellEnd"/>
+      <w:r>
+        <w:rPr>
+          <w:lang w:val="de-DE"/>
+        </w:rPr>
+        <w:t xml:space="preserve"> </w:t>
+      </w:r>
+      <w:proofErr w:type="spellStart"/>
+      <w:r>
+        <w:rPr>
+          <w:lang w:val="de-DE"/>
+        </w:rPr>
+        <w:t>based</w:t>
+      </w:r>
+      <w:proofErr w:type="spellEnd"/>
+      <w:r>
+        <w:rPr>
+          <w:lang w:val="de-DE"/>
+        </w:rPr>
+        <w:t xml:space="preserve"> on the </w:t>
+      </w:r>
+      <w:proofErr w:type="spellStart"/>
+      <w:r>
+        <w:rPr>
+          <w:lang w:val="de-DE"/>
+        </w:rPr>
+        <w:t>law</w:t>
+      </w:r>
+      <w:proofErr w:type="spellEnd"/>
+      <w:r>
+        <w:rPr>
+          <w:lang w:val="de-DE"/>
+        </w:rPr>
+        <w:t xml:space="preserve"> of </w:t>
+      </w:r>
+      <w:proofErr w:type="spellStart"/>
+      <w:r>
+        <w:rPr>
+          <w:lang w:val="de-DE"/>
+        </w:rPr>
+        <w:t>conservation</w:t>
+      </w:r>
+      <w:proofErr w:type="spellEnd"/>
+      <w:r>
+        <w:rPr>
+          <w:lang w:val="de-DE"/>
+        </w:rPr>
+        <w:t xml:space="preserve"> of </w:t>
+      </w:r>
+      <w:proofErr w:type="spellStart"/>
+      <w:r>
+        <w:rPr>
+          <w:lang w:val="de-DE"/>
+        </w:rPr>
+        <w:t>mass</w:t>
+      </w:r>
+      <w:proofErr w:type="spellEnd"/>
+      <w:r>
+        <w:rPr>
+          <w:lang w:val="de-DE"/>
+        </w:rPr>
+        <w:t xml:space="preserve"> and </w:t>
+      </w:r>
+      <w:proofErr w:type="spellStart"/>
+      <w:r>
+        <w:rPr>
+          <w:lang w:val="de-DE"/>
+        </w:rPr>
+        <w:t>evaluates</w:t>
+      </w:r>
+      <w:proofErr w:type="spellEnd"/>
+      <w:r>
+        <w:rPr>
+          <w:lang w:val="de-DE"/>
+        </w:rPr>
+        <w:t xml:space="preserve"> </w:t>
+      </w:r>
+      <w:proofErr w:type="spellStart"/>
+      <w:r>
+        <w:rPr>
+          <w:lang w:val="de-DE"/>
+        </w:rPr>
+        <w:t>input</w:t>
+      </w:r>
+      <w:proofErr w:type="spellEnd"/>
+      <w:r>
+        <w:rPr>
+          <w:lang w:val="de-DE"/>
+        </w:rPr>
+        <w:t xml:space="preserve"> and </w:t>
+      </w:r>
+      <w:proofErr w:type="spellStart"/>
+      <w:r>
+        <w:rPr>
+          <w:lang w:val="de-DE"/>
+        </w:rPr>
+        <w:t>outputs</w:t>
+      </w:r>
+      <w:proofErr w:type="spellEnd"/>
+      <w:r>
+        <w:rPr>
+          <w:lang w:val="de-DE"/>
+        </w:rPr>
+        <w:t xml:space="preserve"> of </w:t>
+      </w:r>
+      <w:proofErr w:type="spellStart"/>
+      <w:r>
+        <w:rPr>
+          <w:lang w:val="de-DE"/>
+        </w:rPr>
+        <w:t>stocks</w:t>
+      </w:r>
+      <w:proofErr w:type="spellEnd"/>
+      <w:r>
+        <w:rPr>
+          <w:lang w:val="de-DE"/>
+        </w:rPr>
+        <w:t xml:space="preserve"> and </w:t>
+      </w:r>
+      <w:proofErr w:type="spellStart"/>
+      <w:r>
+        <w:rPr>
+          <w:lang w:val="de-DE"/>
+        </w:rPr>
+        <w:t>processes</w:t>
+      </w:r>
+      <w:proofErr w:type="spellEnd"/>
+      <w:r>
+        <w:rPr>
+          <w:lang w:val="de-DE"/>
+        </w:rPr>
+        <w:t xml:space="preserve"> </w:t>
+      </w:r>
+      <w:proofErr w:type="spellStart"/>
+      <w:r>
+        <w:rPr>
+          <w:lang w:val="de-DE"/>
+        </w:rPr>
+        <w:t>within</w:t>
+      </w:r>
+      <w:proofErr w:type="spellEnd"/>
+      <w:r>
+        <w:rPr>
+          <w:lang w:val="de-DE"/>
+        </w:rPr>
+        <w:t xml:space="preserve"> a </w:t>
+      </w:r>
+      <w:proofErr w:type="spellStart"/>
+      <w:r>
+        <w:rPr>
+          <w:lang w:val="de-DE"/>
+        </w:rPr>
+        <w:t>system</w:t>
+      </w:r>
+      <w:proofErr w:type="spellEnd"/>
+      <w:r>
+        <w:rPr>
+          <w:lang w:val="de-DE"/>
+        </w:rPr>
+        <w:t xml:space="preserve"> </w:t>
+      </w:r>
+      <w:proofErr w:type="spellStart"/>
+      <w:r>
+        <w:rPr>
+          <w:lang w:val="de-DE"/>
+        </w:rPr>
+        <w:t>defined</w:t>
+      </w:r>
+      <w:proofErr w:type="spellEnd"/>
+      <w:r>
+        <w:rPr>
+          <w:lang w:val="de-DE"/>
+        </w:rPr>
+        <w:t xml:space="preserve"> in </w:t>
+      </w:r>
+      <w:proofErr w:type="spellStart"/>
+      <w:r>
+        <w:rPr>
+          <w:lang w:val="de-DE"/>
+        </w:rPr>
+        <w:t>space</w:t>
+      </w:r>
+      <w:proofErr w:type="spellEnd"/>
+      <w:r>
+        <w:rPr>
+          <w:lang w:val="de-DE"/>
+        </w:rPr>
+        <w:t xml:space="preserve"> and time. </w:t>
       </w:r>
       <w:r>
         <w:t xml:space="preserve">This makes the MFA a valuable carbon management tool, which can provide system evaluations and </w:t>
@@ -706,8 +898,13 @@
         <w:t xml:space="preserve"> like the mineralization of biomass, and in data visualization</w:t>
       </w:r>
       <w:r>
-        <w:t>. Tools, like sankeyMatic</w:t>
-      </w:r>
+        <w:t xml:space="preserve">. Tools, like </w:t>
+      </w:r>
+      <w:proofErr w:type="spellStart"/>
+      <w:r>
+        <w:t>sankeyMatic</w:t>
+      </w:r>
+      <w:proofErr w:type="spellEnd"/>
       <w:r>
         <w:t xml:space="preserve"> (source)</w:t>
       </w:r>
@@ -807,8 +1004,13 @@
       <w:r>
         <w:t xml:space="preserve">. Various researchers used ODYM for </w:t>
       </w:r>
-      <w:r>
-        <w:t>dMFAs in the field of metals (add sources)</w:t>
+      <w:proofErr w:type="spellStart"/>
+      <w:r>
+        <w:t>dMFAs</w:t>
+      </w:r>
+      <w:proofErr w:type="spellEnd"/>
+      <w:r>
+        <w:t xml:space="preserve"> in the field of metals (add sources)</w:t>
       </w:r>
       <w:r>
         <w:t>.</w:t>
@@ -860,6 +1062,7 @@
       <w:r>
         <w:t xml:space="preserve"> </w:t>
       </w:r>
+      <w:proofErr w:type="spellStart"/>
       <w:r>
         <w:t>d</w:t>
       </w:r>
@@ -869,6 +1072,7 @@
       <w:r>
         <w:t>s</w:t>
       </w:r>
+      <w:proofErr w:type="spellEnd"/>
       <w:r>
         <w:t>,</w:t>
       </w:r>
@@ -1947,7 +2151,15 @@
         <w:t xml:space="preserve"> by</w:t>
       </w:r>
       <w:r>
-        <w:t xml:space="preserve"> (Lukas Hoppe, 2020). BioDYM is </w:t>
+        <w:t xml:space="preserve"> (Lukas Hoppe, </w:t>
+      </w:r>
+      <w:proofErr w:type="gramStart"/>
+      <w:r>
+        <w:t>2020).</w:t>
+      </w:r>
+      <w:proofErr w:type="gramEnd"/>
+      <w:r>
+        <w:t xml:space="preserve"> BioDYM is </w:t>
       </w:r>
       <w:r>
         <w:t xml:space="preserve">designed to </w:t>
@@ -2085,7 +2297,15 @@
         <w:t xml:space="preserve">mport </w:t>
       </w:r>
       <w:r>
-        <w:t xml:space="preserve">of the MFA is exclusively done within the BioDYM Data Protocol (Biodym DP). It allows the structured </w:t>
+        <w:t>of the MFA is exclusively done within the BioDYM Data Protocol (</w:t>
+      </w:r>
+      <w:proofErr w:type="spellStart"/>
+      <w:r>
+        <w:t>Biodym</w:t>
+      </w:r>
+      <w:proofErr w:type="spellEnd"/>
+      <w:r>
+        <w:t xml:space="preserve"> DP). It allows the structured </w:t>
       </w:r>
       <w:r>
         <w:t>system definition and the set-up of system boundaries</w:t>
@@ -2154,7 +2374,15 @@
         <w:t>is</w:t>
       </w:r>
       <w:r>
-        <w:t xml:space="preserve"> allows also the use of Biodym, without advanced python knowledge, since the interaction with the code is not required. </w:t>
+        <w:t xml:space="preserve"> allows also the use of </w:t>
+      </w:r>
+      <w:proofErr w:type="spellStart"/>
+      <w:r>
+        <w:t>Biodym</w:t>
+      </w:r>
+      <w:proofErr w:type="spellEnd"/>
+      <w:r>
+        <w:t xml:space="preserve">, without advanced python knowledge, since the interaction with the code is not required. </w:t>
       </w:r>
       <w:r>
         <w:t>The bioDYM D</w:t>
@@ -2229,7 +2457,15 @@
         <w:t xml:space="preserve">e overview </w:t>
       </w:r>
       <w:r>
-        <w:t>of the Biodym D</w:t>
+        <w:t xml:space="preserve">of the </w:t>
+      </w:r>
+      <w:proofErr w:type="spellStart"/>
+      <w:r>
+        <w:t>Biodym</w:t>
+      </w:r>
+      <w:proofErr w:type="spellEnd"/>
+      <w:r>
+        <w:t xml:space="preserve"> D</w:t>
       </w:r>
       <w:r>
         <w:t>P</w:t>
@@ -2545,12 +2781,18 @@
       <w:pPr>
         <w:jc w:val="both"/>
       </w:pPr>
-      <w:r>
-        <w:t>BioDYMs calculation workflow consists of model execution and validation mechanisms. All elements are structured</w:t>
+      <w:proofErr w:type="spellStart"/>
+      <w:r>
+        <w:t>BioDYMs</w:t>
+      </w:r>
+      <w:proofErr w:type="spellEnd"/>
+      <w:r>
+        <w:t xml:space="preserve"> calculation workflow consists of model execution and validation mechanisms. All elements are structured</w:t>
       </w:r>
       <w:r>
         <w:t xml:space="preserve"> based on the execution order in a </w:t>
       </w:r>
+      <w:proofErr w:type="spellStart"/>
       <w:r>
         <w:t>Jup</w:t>
       </w:r>
@@ -2558,7 +2800,11 @@
         <w:t>y</w:t>
       </w:r>
       <w:r>
-        <w:t xml:space="preserve">ter </w:t>
+        <w:t>ter</w:t>
+      </w:r>
+      <w:proofErr w:type="spellEnd"/>
+      <w:r>
+        <w:t xml:space="preserve"> </w:t>
       </w:r>
       <w:r>
         <w:t>N</w:t>
@@ -2674,7 +2920,15 @@
         <w:t>the in-depth analysis of the system</w:t>
       </w:r>
       <w:r>
-        <w:t xml:space="preserve">. All visualizations are interactive with widgets for the selection of specific processes, dynamic time sliders and export functions. </w:t>
+        <w:t xml:space="preserve">. All visualizations are interactive with widgets for the selection of specific processes, dynamic time </w:t>
+      </w:r>
+      <w:proofErr w:type="gramStart"/>
+      <w:r>
+        <w:t>sliders</w:t>
+      </w:r>
+      <w:proofErr w:type="gramEnd"/>
+      <w:r>
+        <w:t xml:space="preserve"> and export functions. </w:t>
       </w:r>
       <w:r>
         <w:t>A c</w:t>
@@ -3921,13 +4175,7 @@
               <w:jc w:val="both"/>
             </w:pPr>
             <w:r>
-              <w:t>P</w:t>
-            </w:r>
-            <w:r>
-              <w:t>8</w:t>
-            </w:r>
-            <w:r>
-              <w:t xml:space="preserve"> </w:t>
+              <w:t>P8</w:t>
             </w:r>
           </w:p>
         </w:tc>
@@ -3940,7 +4188,7 @@
               <w:jc w:val="both"/>
             </w:pPr>
             <w:r>
-              <w:t>Lithosphere</w:t>
+              <w:t>Composting &amp; Incorporation</w:t>
             </w:r>
           </w:p>
         </w:tc>
@@ -3953,7 +4201,7 @@
               <w:jc w:val="both"/>
             </w:pPr>
             <w:r>
-              <w:t>Stock; FOMP</w:t>
+              <w:t>Process, TC</w:t>
             </w:r>
           </w:p>
         </w:tc>
@@ -3966,7 +4214,7 @@
               <w:jc w:val="both"/>
             </w:pPr>
             <w:r>
-              <w:t>Yes (normal distribution)</w:t>
+              <w:t>No</w:t>
             </w:r>
           </w:p>
         </w:tc>
@@ -3978,9 +4226,257 @@
             <w:pPr>
               <w:jc w:val="both"/>
             </w:pPr>
+          </w:p>
+        </w:tc>
+      </w:tr>
+      <w:tr>
+        <w:tc>
+          <w:tcPr>
+            <w:tcW w:w="606" w:type="dxa"/>
+          </w:tcPr>
+          <w:p>
+            <w:pPr>
+              <w:jc w:val="both"/>
+            </w:pPr>
+            <w:r>
+              <w:t>P9</w:t>
+            </w:r>
+          </w:p>
+        </w:tc>
+        <w:tc>
+          <w:tcPr>
+            <w:tcW w:w="1875" w:type="dxa"/>
+          </w:tcPr>
+          <w:p>
+            <w:pPr>
+              <w:jc w:val="both"/>
+            </w:pPr>
+            <w:r>
+              <w:t>Lithosphere</w:t>
+            </w:r>
+            <w:r>
+              <w:t xml:space="preserve"> (C&amp;I)</w:t>
+            </w:r>
+          </w:p>
+        </w:tc>
+        <w:tc>
+          <w:tcPr>
+            <w:tcW w:w="2334" w:type="dxa"/>
+          </w:tcPr>
+          <w:p>
+            <w:pPr>
+              <w:jc w:val="both"/>
+            </w:pPr>
+            <w:proofErr w:type="gramStart"/>
+            <w:r>
+              <w:t>Stock</w:t>
+            </w:r>
+            <w:proofErr w:type="gramEnd"/>
+            <w:r>
+              <w:t>; FOMP</w:t>
+            </w:r>
+          </w:p>
+        </w:tc>
+        <w:tc>
+          <w:tcPr>
+            <w:tcW w:w="1567" w:type="dxa"/>
+          </w:tcPr>
+          <w:p>
+            <w:pPr>
+              <w:jc w:val="both"/>
+            </w:pPr>
+            <w:r>
+              <w:t>Yes (normal distribution)</w:t>
+            </w:r>
+          </w:p>
+        </w:tc>
+        <w:tc>
+          <w:tcPr>
+            <w:tcW w:w="2968" w:type="dxa"/>
+          </w:tcPr>
+          <w:p>
+            <w:pPr>
+              <w:jc w:val="both"/>
+            </w:pPr>
             <w:r>
               <w:t>The soil as large carbon stock, including slow mineralization processes of carbon</w:t>
             </w:r>
+          </w:p>
+        </w:tc>
+      </w:tr>
+      <w:tr>
+        <w:tc>
+          <w:tcPr>
+            <w:tcW w:w="606" w:type="dxa"/>
+          </w:tcPr>
+          <w:p>
+            <w:pPr>
+              <w:jc w:val="both"/>
+            </w:pPr>
+            <w:r>
+              <w:t xml:space="preserve">P8 </w:t>
+            </w:r>
+          </w:p>
+        </w:tc>
+        <w:tc>
+          <w:tcPr>
+            <w:tcW w:w="1875" w:type="dxa"/>
+          </w:tcPr>
+          <w:p>
+            <w:pPr>
+              <w:jc w:val="both"/>
+            </w:pPr>
+            <w:r>
+              <w:t>Lithosphere (DI)</w:t>
+            </w:r>
+          </w:p>
+        </w:tc>
+        <w:tc>
+          <w:tcPr>
+            <w:tcW w:w="2334" w:type="dxa"/>
+          </w:tcPr>
+          <w:p>
+            <w:pPr>
+              <w:jc w:val="both"/>
+            </w:pPr>
+            <w:proofErr w:type="gramStart"/>
+            <w:r>
+              <w:t>Stock</w:t>
+            </w:r>
+            <w:proofErr w:type="gramEnd"/>
+            <w:r>
+              <w:t>; FOMP</w:t>
+            </w:r>
+          </w:p>
+        </w:tc>
+        <w:tc>
+          <w:tcPr>
+            <w:tcW w:w="1567" w:type="dxa"/>
+          </w:tcPr>
+          <w:p>
+            <w:pPr>
+              <w:jc w:val="both"/>
+            </w:pPr>
+            <w:r>
+              <w:t>Yes (normal distribution)</w:t>
+            </w:r>
+          </w:p>
+        </w:tc>
+        <w:tc>
+          <w:tcPr>
+            <w:tcW w:w="2968" w:type="dxa"/>
+          </w:tcPr>
+          <w:p>
+            <w:pPr>
+              <w:jc w:val="both"/>
+            </w:pPr>
+            <w:r>
+              <w:t>The soil as large carbon stock, including slow mineralization processes of carbon</w:t>
+            </w:r>
+          </w:p>
+        </w:tc>
+      </w:tr>
+      <w:tr>
+        <w:tc>
+          <w:tcPr>
+            <w:tcW w:w="606" w:type="dxa"/>
+          </w:tcPr>
+          <w:p>
+            <w:pPr>
+              <w:jc w:val="both"/>
+            </w:pPr>
+          </w:p>
+        </w:tc>
+        <w:tc>
+          <w:tcPr>
+            <w:tcW w:w="1875" w:type="dxa"/>
+          </w:tcPr>
+          <w:p>
+            <w:pPr>
+              <w:jc w:val="both"/>
+            </w:pPr>
+          </w:p>
+        </w:tc>
+        <w:tc>
+          <w:tcPr>
+            <w:tcW w:w="2334" w:type="dxa"/>
+          </w:tcPr>
+          <w:p>
+            <w:pPr>
+              <w:jc w:val="both"/>
+            </w:pPr>
+          </w:p>
+        </w:tc>
+        <w:tc>
+          <w:tcPr>
+            <w:tcW w:w="1567" w:type="dxa"/>
+          </w:tcPr>
+          <w:p>
+            <w:pPr>
+              <w:jc w:val="both"/>
+            </w:pPr>
+          </w:p>
+        </w:tc>
+        <w:tc>
+          <w:tcPr>
+            <w:tcW w:w="2968" w:type="dxa"/>
+          </w:tcPr>
+          <w:p>
+            <w:pPr>
+              <w:jc w:val="both"/>
+            </w:pPr>
+          </w:p>
+        </w:tc>
+      </w:tr>
+      <w:tr>
+        <w:tc>
+          <w:tcPr>
+            <w:tcW w:w="606" w:type="dxa"/>
+          </w:tcPr>
+          <w:p>
+            <w:pPr>
+              <w:jc w:val="both"/>
+            </w:pPr>
+          </w:p>
+        </w:tc>
+        <w:tc>
+          <w:tcPr>
+            <w:tcW w:w="1875" w:type="dxa"/>
+          </w:tcPr>
+          <w:p>
+            <w:pPr>
+              <w:jc w:val="both"/>
+            </w:pPr>
+          </w:p>
+        </w:tc>
+        <w:tc>
+          <w:tcPr>
+            <w:tcW w:w="2334" w:type="dxa"/>
+          </w:tcPr>
+          <w:p>
+            <w:pPr>
+              <w:jc w:val="both"/>
+            </w:pPr>
+          </w:p>
+        </w:tc>
+        <w:tc>
+          <w:tcPr>
+            <w:tcW w:w="1567" w:type="dxa"/>
+          </w:tcPr>
+          <w:p>
+            <w:pPr>
+              <w:jc w:val="both"/>
+            </w:pPr>
+          </w:p>
+        </w:tc>
+        <w:tc>
+          <w:tcPr>
+            <w:tcW w:w="2968" w:type="dxa"/>
+          </w:tcPr>
+          <w:p>
+            <w:pPr>
+              <w:jc w:val="both"/>
+            </w:pPr>
           </w:p>
         </w:tc>
       </w:tr>
@@ -4060,7 +4556,11 @@
         <w:t xml:space="preserve">material </w:t>
       </w:r>
       <w:r>
-        <w:t>flow data about the annual yield (Yt) of wheat straw from 2025 -2050. Assumed is an agricultural area for wheat cultivation of 1</w:t>
+        <w:t xml:space="preserve">flow data </w:t>
+      </w:r>
+      <w:r>
+        <w:lastRenderedPageBreak/>
+        <w:t>about the annual yield (Yt) of wheat straw from 2025 -2050. Assumed is an agricultural area for wheat cultivation of 1</w:t>
       </w:r>
       <w:r>
         <w:t>.</w:t>
@@ -5189,6 +5689,7 @@
         <w:jc w:val="both"/>
       </w:pPr>
       <w:r>
+        <w:lastRenderedPageBreak/>
         <w:t xml:space="preserve">The Monte </w:t>
       </w:r>
       <w:r>
@@ -5217,8 +5718,17 @@
           <w:b/>
           <w:bCs/>
         </w:rPr>
-        <w:t>Scenario Set-UP</w:t>
-      </w:r>
+        <w:t xml:space="preserve">Scenario </w:t>
+      </w:r>
+      <w:proofErr w:type="spellStart"/>
+      <w:r>
+        <w:rPr>
+          <w:b/>
+          <w:bCs/>
+        </w:rPr>
+        <w:t>Set-UP</w:t>
+      </w:r>
+      <w:proofErr w:type="spellEnd"/>
       <w:r>
         <w:rPr>
           <w:b/>
@@ -5237,7 +5747,6 @@
         <w:jc w:val="both"/>
       </w:pPr>
       <w:r>
-        <w:lastRenderedPageBreak/>
         <w:t xml:space="preserve">Case Study 2: </w:t>
       </w:r>
       <w:r>
@@ -5369,7 +5878,15 @@
         <w:t>use-phase</w:t>
       </w:r>
       <w:r>
-        <w:t xml:space="preserve"> of different products with individual life times and the</w:t>
+        <w:t xml:space="preserve"> of different products with individual </w:t>
+      </w:r>
+      <w:proofErr w:type="gramStart"/>
+      <w:r>
+        <w:t>life times</w:t>
+      </w:r>
+      <w:proofErr w:type="gramEnd"/>
+      <w:r>
+        <w:t xml:space="preserve"> and the</w:t>
       </w:r>
       <w:r>
         <w:t xml:space="preserve"> EoL-phase</w:t>
@@ -5451,6 +5968,7 @@
           <w:kern w:val="0"/>
           <w14:ligatures w14:val="none"/>
         </w:rPr>
+        <w:lastRenderedPageBreak/>
         <w:drawing>
           <wp:inline distT="0" distB="0" distL="0" distR="0" wp14:anchorId="7B72BA3C" wp14:editId="5B7AEAC5">
             <wp:extent cx="6144282" cy="3012471"/>
@@ -5506,7 +6024,6 @@
         <w:pStyle w:val="Heading1"/>
       </w:pPr>
       <w:r>
-        <w:lastRenderedPageBreak/>
         <w:t>Results</w:t>
       </w:r>
     </w:p>
@@ -5518,7 +6035,39 @@
         <w:t>BioDYM allows the dynamic material flow analysis of biogenic systems with the purpose of carbon cycle assessment. The application of BioDYM on two complex case-studies provides insights into the potentials of applications.</w:t>
       </w:r>
       <w:r>
-        <w:t xml:space="preserve"> Both case-studies are able to indicate the carbon storage potentials of the system and also the impact of the time on the carbon management approach. </w:t>
+        <w:t xml:space="preserve"> Both </w:t>
+      </w:r>
+      <w:proofErr w:type="gramStart"/>
+      <w:r>
+        <w:t>case-studies</w:t>
+      </w:r>
+      <w:proofErr w:type="gramEnd"/>
+      <w:r>
+        <w:t xml:space="preserve"> </w:t>
+      </w:r>
+      <w:proofErr w:type="gramStart"/>
+      <w:r>
+        <w:t>are able to</w:t>
+      </w:r>
+      <w:proofErr w:type="gramEnd"/>
+      <w:r>
+        <w:t xml:space="preserve"> indicate the carbon storage </w:t>
+      </w:r>
+      <w:proofErr w:type="gramStart"/>
+      <w:r>
+        <w:t>potentials</w:t>
+      </w:r>
+      <w:proofErr w:type="gramEnd"/>
+      <w:r>
+        <w:t xml:space="preserve"> of the system </w:t>
+      </w:r>
+      <w:proofErr w:type="gramStart"/>
+      <w:r>
+        <w:t>and also</w:t>
+      </w:r>
+      <w:proofErr w:type="gramEnd"/>
+      <w:r>
+        <w:t xml:space="preserve"> the impact of the time on the carbon management approach. </w:t>
       </w:r>
     </w:p>
     <w:p>
@@ -5552,7 +6101,23 @@
         <w:t xml:space="preserve">iomass contains in the median </w:t>
       </w:r>
       <w:r>
-        <w:t xml:space="preserve">carbon content of 340.000 Mg biogenic carbon. Most of the carbon is directly consumed and transferred back to the initial stages. Figure X-X are able to express the material, the Water, the drymass and the carbon flows. </w:t>
+        <w:t xml:space="preserve">carbon content of 340.000 Mg biogenic carbon. Most of the carbon is directly consumed and transferred back to the initial stages. Figure X-X </w:t>
+      </w:r>
+      <w:proofErr w:type="gramStart"/>
+      <w:r>
+        <w:t>are able to</w:t>
+      </w:r>
+      <w:proofErr w:type="gramEnd"/>
+      <w:r>
+        <w:t xml:space="preserve"> express the material, the Water, the </w:t>
+      </w:r>
+      <w:proofErr w:type="spellStart"/>
+      <w:r>
+        <w:t>drymass</w:t>
+      </w:r>
+      <w:proofErr w:type="spellEnd"/>
+      <w:r>
+        <w:t xml:space="preserve"> and the carbon flows. </w:t>
       </w:r>
       <w:r>
         <w:t>The</w:t>
@@ -5599,6 +6164,7 @@
               <w:rPr>
                 <w:noProof/>
               </w:rPr>
+              <w:lastRenderedPageBreak/>
               <w:drawing>
                 <wp:inline distT="0" distB="0" distL="0" distR="0" wp14:anchorId="79607E3C" wp14:editId="68837E47">
                   <wp:extent cx="2408922" cy="1800000"/>
@@ -5826,7 +6392,15 @@
               <w:t>carbon</w:t>
             </w:r>
             <w:r>
-              <w:t xml:space="preserve"> flow in year 2050.</w:t>
+              <w:t xml:space="preserve"> flow </w:t>
+            </w:r>
+            <w:proofErr w:type="gramStart"/>
+            <w:r>
+              <w:t>in year</w:t>
+            </w:r>
+            <w:proofErr w:type="gramEnd"/>
+            <w:r>
+              <w:t xml:space="preserve"> 2050.</w:t>
             </w:r>
           </w:p>
         </w:tc>
@@ -5835,7 +6409,6 @@
     <w:p/>
     <w:p>
       <w:r>
-        <w:lastRenderedPageBreak/>
         <w:t xml:space="preserve">The carbon within the soil is directly </w:t>
       </w:r>
     </w:p>
@@ -5978,6 +6551,7 @@
         <w:pStyle w:val="Heading1"/>
       </w:pPr>
       <w:r>
+        <w:lastRenderedPageBreak/>
         <w:t>Discussion</w:t>
       </w:r>
     </w:p>
@@ -6226,9 +6800,11 @@
             <w:tcW w:w="4675" w:type="dxa"/>
           </w:tcPr>
           <w:p>
+            <w:proofErr w:type="spellStart"/>
             <w:r>
               <w:t>DynTCs</w:t>
             </w:r>
+            <w:proofErr w:type="spellEnd"/>
           </w:p>
         </w:tc>
       </w:tr>
@@ -6248,9 +6824,11 @@
             <w:tcW w:w="4675" w:type="dxa"/>
           </w:tcPr>
           <w:p>
+            <w:proofErr w:type="spellStart"/>
             <w:r>
               <w:t>InitS</w:t>
             </w:r>
+            <w:proofErr w:type="spellEnd"/>
           </w:p>
         </w:tc>
       </w:tr>
@@ -6294,7 +6872,15 @@
     <w:p/>
     <w:p>
       <w:r>
-        <w:t>Objective of the study is the application of the ODYM Framework for the development of the bioDYM framework, that fullfilles the following requirements:</w:t>
+        <w:t xml:space="preserve">Objective of the study is the application of the ODYM Framework for the development of the bioDYM framework, that </w:t>
+      </w:r>
+      <w:proofErr w:type="spellStart"/>
+      <w:r>
+        <w:t>fullfilles</w:t>
+      </w:r>
+      <w:proofErr w:type="spellEnd"/>
+      <w:r>
+        <w:t xml:space="preserve"> the following requirements:</w:t>
       </w:r>
     </w:p>
     <w:p>
@@ -6306,8 +6892,23 @@
         </w:numPr>
       </w:pPr>
       <w:r>
-        <w:lastRenderedPageBreak/>
-        <w:t>Specific for the requirements of biomass: Freshmass, WC, Drymass,</w:t>
+        <w:t xml:space="preserve">Specific for the requirements of biomass: </w:t>
+      </w:r>
+      <w:proofErr w:type="spellStart"/>
+      <w:r>
+        <w:t>Freshmass</w:t>
+      </w:r>
+      <w:proofErr w:type="spellEnd"/>
+      <w:r>
+        <w:t xml:space="preserve">, WC, </w:t>
+      </w:r>
+      <w:proofErr w:type="spellStart"/>
+      <w:r>
+        <w:t>Drymass</w:t>
+      </w:r>
+      <w:proofErr w:type="spellEnd"/>
+      <w:r>
+        <w:t>,</w:t>
       </w:r>
     </w:p>
     <w:p>
@@ -6319,7 +6920,15 @@
         </w:numPr>
       </w:pPr>
       <w:r>
-        <w:t>Dynamic stock modelling. Individual life times within the use phase</w:t>
+        <w:t xml:space="preserve">Dynamic stock modelling. Individual </w:t>
+      </w:r>
+      <w:proofErr w:type="gramStart"/>
+      <w:r>
+        <w:t>life times</w:t>
+      </w:r>
+      <w:proofErr w:type="gramEnd"/>
+      <w:r>
+        <w:t xml:space="preserve"> within the use phase</w:t>
       </w:r>
     </w:p>
     <w:p>
@@ -6379,7 +6988,23 @@
         </w:numPr>
       </w:pPr>
       <w:r>
-        <w:t xml:space="preserve">The model_configuration allows the set-up of all major settings and system boundaries of bioDYM. The selectable is the timeframe, the selection of special processes and the use and the size of a monte Carlo simulation. A scenario manager allows to set up scenarios for result comparison. </w:t>
+        <w:t xml:space="preserve">The </w:t>
+      </w:r>
+      <w:proofErr w:type="spellStart"/>
+      <w:r>
+        <w:t>model_configuration</w:t>
+      </w:r>
+      <w:proofErr w:type="spellEnd"/>
+      <w:r>
+        <w:t xml:space="preserve"> allows the set-up of all major settings and system boundaries of bioDYM. The selectable is the timeframe, the selection of special processes and the use and the size of a monte Carlo simulation. A scenario manager </w:t>
+      </w:r>
+      <w:proofErr w:type="gramStart"/>
+      <w:r>
+        <w:t>allows</w:t>
+      </w:r>
+      <w:proofErr w:type="gramEnd"/>
+      <w:r>
+        <w:t xml:space="preserve"> to set up scenarios for result comparison. </w:t>
       </w:r>
     </w:p>
     <w:p>
@@ -6391,6 +7016,7 @@
         </w:numPr>
       </w:pPr>
       <w:r>
+        <w:lastRenderedPageBreak/>
         <w:t xml:space="preserve">The </w:t>
       </w:r>
       <w:r>
@@ -6432,7 +7058,15 @@
         <w:t>2_1_Definition_Processes</w:t>
       </w:r>
       <w:r>
-        <w:t xml:space="preserve">” has the objective to define the processes of the model including the process properties. These properties define the process type (Input/ process/ output), the use of Transfer coefficient &amp; Dynamic Transfer coefficient, the presence of an stock or an initial stock and initialize the special processes Dynamic Stock Modelling and FOMP. The individual properties are defined in the pages </w:t>
+        <w:t xml:space="preserve">” has the objective to define the processes of the model including the process properties. These properties define the process type (Input/ process/ output), the use of Transfer coefficient &amp; Dynamic Transfer coefficient, the presence of </w:t>
+      </w:r>
+      <w:proofErr w:type="gramStart"/>
+      <w:r>
+        <w:t>an</w:t>
+      </w:r>
+      <w:proofErr w:type="gramEnd"/>
+      <w:r>
+        <w:t xml:space="preserve"> stock or an initial stock and initialize the special processes Dynamic Stock Modelling and FOMP. The individual properties are defined in the pages </w:t>
       </w:r>
       <w:r>
         <w:t>2_3_Process_TCs</w:t>
@@ -6467,7 +7101,15 @@
     </w:p>
     <w:p>
       <w:r>
-        <w:t>The protocol applies several data management principles, data validation routines and color guiding system, as an assistance to lower the entry level of the application.</w:t>
+        <w:t xml:space="preserve">The protocol applies several data management principles, data validation routines and color guiding system, as an </w:t>
+      </w:r>
+      <w:proofErr w:type="gramStart"/>
+      <w:r>
+        <w:t>assistance</w:t>
+      </w:r>
+      <w:proofErr w:type="gramEnd"/>
+      <w:r>
+        <w:t xml:space="preserve"> to lower the entry level of the application.</w:t>
       </w:r>
     </w:p>
     <w:p/>
@@ -6493,11 +7135,31 @@
         <w:jc w:val="both"/>
       </w:pPr>
       <w:r>
-        <w:t xml:space="preserve">To ensure the expected high usability of Biodym, the setup and data loading process is limited to the selection of the data upload path of the Biodym-DP in the Biodym-NB. With the initialization of bioDYM, the required packages and functions are loaded and initialized. All study-related parameters like model configuration, flows, processes, are loaded from the excel file, saved as variables and are used for the model calculation in </w:t>
-      </w:r>
-      <w:r>
-        <w:lastRenderedPageBreak/>
-        <w:t>step 2. The settings within the model configuration decide which specific calculations are executed.</w:t>
+        <w:t xml:space="preserve">To ensure the expected high usability of </w:t>
+      </w:r>
+      <w:proofErr w:type="spellStart"/>
+      <w:r>
+        <w:t>Biodym</w:t>
+      </w:r>
+      <w:proofErr w:type="spellEnd"/>
+      <w:r>
+        <w:t xml:space="preserve">, the setup and data loading process is limited to the selection of the data upload path of the </w:t>
+      </w:r>
+      <w:proofErr w:type="spellStart"/>
+      <w:r>
+        <w:t>Biodym</w:t>
+      </w:r>
+      <w:proofErr w:type="spellEnd"/>
+      <w:r>
+        <w:t xml:space="preserve">-DP in the </w:t>
+      </w:r>
+      <w:proofErr w:type="spellStart"/>
+      <w:r>
+        <w:t>Biodym</w:t>
+      </w:r>
+      <w:proofErr w:type="spellEnd"/>
+      <w:r>
+        <w:t>-NB. With the initialization of bioDYM, the required packages and functions are loaded and initialized. All study-related parameters like model configuration, flows, processes, are loaded from the excel file, saved as variables and are used for the model calculation in step 2. The settings within the model configuration decide which specific calculations are executed.</w:t>
       </w:r>
     </w:p>
     <w:p>
@@ -6514,7 +7176,23 @@
         <w:jc w:val="both"/>
       </w:pPr>
       <w:r>
-        <w:t xml:space="preserve">The calculation engine contains the relevant calculation functions for the standard processes as well as the special processes, including the monte carlo calculation and the scenario calculation. To allow the data validation, the model provides a simple qualitative flow diagram and an dynamic mass balance check, for all elemental layers. </w:t>
+        <w:t xml:space="preserve">The calculation engine contains the relevant calculation functions for the standard processes as well as the special processes, including the monte </w:t>
+      </w:r>
+      <w:proofErr w:type="spellStart"/>
+      <w:r>
+        <w:t>carlo</w:t>
+      </w:r>
+      <w:proofErr w:type="spellEnd"/>
+      <w:r>
+        <w:t xml:space="preserve"> calculation and the scenario calculation. To allow the data validation, the model provides a simple qualitative flow diagram and </w:t>
+      </w:r>
+      <w:proofErr w:type="gramStart"/>
+      <w:r>
+        <w:t>an</w:t>
+      </w:r>
+      <w:proofErr w:type="gramEnd"/>
+      <w:r>
+        <w:t xml:space="preserve"> dynamic mass balance check, for all elemental layers. </w:t>
       </w:r>
     </w:p>
     <w:p/>

</xml_diff>